<commit_message>
commit - export and import jobs feature
</commit_message>
<xml_diff>
--- a/RESUME_GOUTHAM_REDDY_GUNNALA.docx
+++ b/RESUME_GOUTHAM_REDDY_GUNNALA.docx
@@ -48,51 +48,7 @@
           <w:lang w:eastAsia="en-GB"/>
           <w14:ligatures w14:val="none"/>
         </w:rPr>
-        <w:t>gunnalagouthamreddy0@gmail.com| 913-</w:t>
-      </w:r>
-      <w:r>
-        <w:rPr>
-          <w:rFonts w:ascii="Century Gothic" w:eastAsia="Times New Roman" w:hAnsi="Century Gothic" w:cs="Times New Roman"/>
-          <w:kern w:val="0"/>
-          <w:sz w:val="20"/>
-          <w:szCs w:val="20"/>
-          <w:lang w:eastAsia="en-GB"/>
-          <w14:ligatures w14:val="none"/>
-        </w:rPr>
-        <w:t>406</w:t>
-      </w:r>
-      <w:r>
-        <w:rPr>
-          <w:rFonts w:ascii="Century Gothic" w:eastAsia="Times New Roman" w:hAnsi="Century Gothic" w:cs="Times New Roman"/>
-          <w:kern w:val="0"/>
-          <w:sz w:val="20"/>
-          <w:szCs w:val="20"/>
-          <w:lang w:eastAsia="en-GB"/>
-          <w14:ligatures w14:val="none"/>
-        </w:rPr>
-        <w:t>-</w:t>
-      </w:r>
-      <w:r>
-        <w:rPr>
-          <w:rFonts w:ascii="Century Gothic" w:eastAsia="Times New Roman" w:hAnsi="Century Gothic" w:cs="Times New Roman"/>
-          <w:kern w:val="0"/>
-          <w:sz w:val="20"/>
-          <w:szCs w:val="20"/>
-          <w:lang w:eastAsia="en-GB"/>
-          <w14:ligatures w14:val="none"/>
-        </w:rPr>
-        <w:t>5191</w:t>
-      </w:r>
-      <w:r>
-        <w:rPr>
-          <w:rFonts w:ascii="Century Gothic" w:eastAsia="Times New Roman" w:hAnsi="Century Gothic" w:cs="Times New Roman"/>
-          <w:kern w:val="0"/>
-          <w:sz w:val="20"/>
-          <w:szCs w:val="20"/>
-          <w:lang w:eastAsia="en-GB"/>
-          <w14:ligatures w14:val="none"/>
-        </w:rPr>
-        <w:t xml:space="preserve"> | </w:t>
+        <w:t xml:space="preserve">gunnalagouthamreddy0@gmail.com| 913-406-5191 | </w:t>
       </w:r>
       <w:hyperlink r:id="rId5" w:history="1">
         <w:r>
@@ -105,31 +61,7 @@
             <w:lang w:eastAsia="en-GB"/>
             <w14:ligatures w14:val="none"/>
           </w:rPr>
-          <w:t>Link</w:t>
-        </w:r>
-        <w:r>
-          <w:rPr>
-            <w:rStyle w:val="Hyperlink"/>
-            <w:rFonts w:ascii="Century Gothic" w:eastAsia="Times New Roman" w:hAnsi="Century Gothic" w:cs="Times New Roman"/>
-            <w:kern w:val="0"/>
-            <w:sz w:val="20"/>
-            <w:szCs w:val="20"/>
-            <w:lang w:eastAsia="en-GB"/>
-            <w14:ligatures w14:val="none"/>
-          </w:rPr>
-          <w:t>e</w:t>
-        </w:r>
-        <w:r>
-          <w:rPr>
-            <w:rStyle w:val="Hyperlink"/>
-            <w:rFonts w:ascii="Century Gothic" w:eastAsia="Times New Roman" w:hAnsi="Century Gothic" w:cs="Times New Roman"/>
-            <w:kern w:val="0"/>
-            <w:sz w:val="20"/>
-            <w:szCs w:val="20"/>
-            <w:lang w:eastAsia="en-GB"/>
-            <w14:ligatures w14:val="none"/>
-          </w:rPr>
-          <w:t>dIn</w:t>
+          <w:t>LinkedIn</w:t>
         </w:r>
       </w:hyperlink>
       <w:r>
@@ -266,7 +198,7 @@
           <w:lang w:eastAsia="en-GB"/>
           <w14:ligatures w14:val="none"/>
         </w:rPr>
-        <w:t>Results-driven Senior AI/ML Engineer with 6+ years of experience building scalable production AI systems using LLMs, multimodal models, agentic AI frameworks, and deep learning across energy, finance, healthcare, and retail domains.</w:t>
+        <w:t>Results-driven Senior AI/ML Engineer with 6+ years of full-stack experience building and shipping production AI systems end-to-end, from data pipelines and model training through API layers and user-facing interfaces, across energy, finance, healthcare, and retail domains.</w:t>
       </w:r>
     </w:p>
     <w:p>
@@ -296,103 +228,7 @@
           <w:lang w:eastAsia="en-GB"/>
           <w14:ligatures w14:val="none"/>
         </w:rPr>
-        <w:t>Specialized in building and deploying generative AI pipelines, multi-agent systems, and fine-tuned LLMs (</w:t>
-      </w:r>
-      <w:proofErr w:type="spellStart"/>
-      <w:r>
-        <w:rPr>
-          <w:rFonts w:ascii="Century Gothic" w:eastAsia="Times New Roman" w:hAnsi="Century Gothic" w:cs="Times New Roman"/>
-          <w:kern w:val="0"/>
-          <w:sz w:val="15"/>
-          <w:szCs w:val="15"/>
-          <w:lang w:eastAsia="en-GB"/>
-          <w14:ligatures w14:val="none"/>
-        </w:rPr>
-        <w:t>LoRA</w:t>
-      </w:r>
-      <w:proofErr w:type="spellEnd"/>
-      <w:r>
-        <w:rPr>
-          <w:rFonts w:ascii="Century Gothic" w:eastAsia="Times New Roman" w:hAnsi="Century Gothic" w:cs="Times New Roman"/>
-          <w:kern w:val="0"/>
-          <w:sz w:val="15"/>
-          <w:szCs w:val="15"/>
-          <w:lang w:eastAsia="en-GB"/>
-          <w14:ligatures w14:val="none"/>
-        </w:rPr>
-        <w:t xml:space="preserve">, </w:t>
-      </w:r>
-      <w:proofErr w:type="spellStart"/>
-      <w:r>
-        <w:rPr>
-          <w:rFonts w:ascii="Century Gothic" w:eastAsia="Times New Roman" w:hAnsi="Century Gothic" w:cs="Times New Roman"/>
-          <w:kern w:val="0"/>
-          <w:sz w:val="15"/>
-          <w:szCs w:val="15"/>
-          <w:lang w:eastAsia="en-GB"/>
-          <w14:ligatures w14:val="none"/>
-        </w:rPr>
-        <w:t>QLoRA</w:t>
-      </w:r>
-      <w:proofErr w:type="spellEnd"/>
-      <w:r>
-        <w:rPr>
-          <w:rFonts w:ascii="Century Gothic" w:eastAsia="Times New Roman" w:hAnsi="Century Gothic" w:cs="Times New Roman"/>
-          <w:kern w:val="0"/>
-          <w:sz w:val="15"/>
-          <w:szCs w:val="15"/>
-          <w:lang w:eastAsia="en-GB"/>
-          <w14:ligatures w14:val="none"/>
-        </w:rPr>
-        <w:t xml:space="preserve">, PEFT) using </w:t>
-      </w:r>
-      <w:proofErr w:type="spellStart"/>
-      <w:r>
-        <w:rPr>
-          <w:rFonts w:ascii="Century Gothic" w:eastAsia="Times New Roman" w:hAnsi="Century Gothic" w:cs="Times New Roman"/>
-          <w:kern w:val="0"/>
-          <w:sz w:val="15"/>
-          <w:szCs w:val="15"/>
-          <w:lang w:eastAsia="en-GB"/>
-          <w14:ligatures w14:val="none"/>
-        </w:rPr>
-        <w:t>PyTorch</w:t>
-      </w:r>
-      <w:proofErr w:type="spellEnd"/>
-      <w:r>
-        <w:rPr>
-          <w:rFonts w:ascii="Century Gothic" w:eastAsia="Times New Roman" w:hAnsi="Century Gothic" w:cs="Times New Roman"/>
-          <w:kern w:val="0"/>
-          <w:sz w:val="15"/>
-          <w:szCs w:val="15"/>
-          <w:lang w:eastAsia="en-GB"/>
-          <w14:ligatures w14:val="none"/>
-        </w:rPr>
-        <w:t xml:space="preserve">, TensorFlow, Hugging Face, LangChain, </w:t>
-      </w:r>
-      <w:proofErr w:type="spellStart"/>
-      <w:r>
-        <w:rPr>
-          <w:rFonts w:ascii="Century Gothic" w:eastAsia="Times New Roman" w:hAnsi="Century Gothic" w:cs="Times New Roman"/>
-          <w:kern w:val="0"/>
-          <w:sz w:val="15"/>
-          <w:szCs w:val="15"/>
-          <w:lang w:eastAsia="en-GB"/>
-          <w14:ligatures w14:val="none"/>
-        </w:rPr>
-        <w:t>LangGraph</w:t>
-      </w:r>
-      <w:proofErr w:type="spellEnd"/>
-      <w:r>
-        <w:rPr>
-          <w:rFonts w:ascii="Century Gothic" w:eastAsia="Times New Roman" w:hAnsi="Century Gothic" w:cs="Times New Roman"/>
-          <w:kern w:val="0"/>
-          <w:sz w:val="15"/>
-          <w:szCs w:val="15"/>
-          <w:lang w:eastAsia="en-GB"/>
-          <w14:ligatures w14:val="none"/>
-        </w:rPr>
-        <w:t>, and OpenAI/Anthropic APIs for real-time text, image, code generation, and agentic workflows.</w:t>
+        <w:t xml:space="preserve">Specialized in architecting generative AI applications and multi-agent systems, integrating fine-tuned LLMs (LoRA, QLoRA, PEFT) built with PyTorch, TensorFlow, Hugging Face, LangChain, and LangGraph behind FastAPI, Flask, REST, and GraphQL services for production use.</w:t>
       </w:r>
     </w:p>
     <w:p>
@@ -422,55 +258,7 @@
           <w:lang w:eastAsia="en-GB"/>
           <w14:ligatures w14:val="none"/>
         </w:rPr>
-        <w:t xml:space="preserve">Proficient in vector database search (FAISS, Pinecone, </w:t>
-      </w:r>
-      <w:proofErr w:type="spellStart"/>
-      <w:r>
-        <w:rPr>
-          <w:rFonts w:ascii="Century Gothic" w:eastAsia="Times New Roman" w:hAnsi="Century Gothic" w:cs="Times New Roman"/>
-          <w:kern w:val="0"/>
-          <w:sz w:val="15"/>
-          <w:szCs w:val="15"/>
-          <w:lang w:eastAsia="en-GB"/>
-          <w14:ligatures w14:val="none"/>
-        </w:rPr>
-        <w:t>Weaviate</w:t>
-      </w:r>
-      <w:proofErr w:type="spellEnd"/>
-      <w:r>
-        <w:rPr>
-          <w:rFonts w:ascii="Century Gothic" w:eastAsia="Times New Roman" w:hAnsi="Century Gothic" w:cs="Times New Roman"/>
-          <w:kern w:val="0"/>
-          <w:sz w:val="15"/>
-          <w:szCs w:val="15"/>
-          <w:lang w:eastAsia="en-GB"/>
-          <w14:ligatures w14:val="none"/>
-        </w:rPr>
-        <w:t xml:space="preserve">, Milvus), RAG architectures, </w:t>
-      </w:r>
-      <w:proofErr w:type="spellStart"/>
-      <w:r>
-        <w:rPr>
-          <w:rFonts w:ascii="Century Gothic" w:eastAsia="Times New Roman" w:hAnsi="Century Gothic" w:cs="Times New Roman"/>
-          <w:kern w:val="0"/>
-          <w:sz w:val="15"/>
-          <w:szCs w:val="15"/>
-          <w:lang w:eastAsia="en-GB"/>
-          <w14:ligatures w14:val="none"/>
-        </w:rPr>
-        <w:t>LlamaIndex</w:t>
-      </w:r>
-      <w:proofErr w:type="spellEnd"/>
-      <w:r>
-        <w:rPr>
-          <w:rFonts w:ascii="Century Gothic" w:eastAsia="Times New Roman" w:hAnsi="Century Gothic" w:cs="Times New Roman"/>
-          <w:kern w:val="0"/>
-          <w:sz w:val="15"/>
-          <w:szCs w:val="15"/>
-          <w:lang w:eastAsia="en-GB"/>
-          <w14:ligatures w14:val="none"/>
-        </w:rPr>
-        <w:t>, semantic chunking, embedding pipelines, multi-turn memory optimization, and hallucination reduction strategies for production LLM applications.</w:t>
+        <w:t xml:space="preserve">Proficient across the AI application stack, from vector database search (FAISS, Pinecone) and RAG architectures on the retrieval side to Streamlit, Gradio, and JavaScript-driven interfaces on the front end, for real-time, user-facing LLM applications.</w:t>
       </w:r>
     </w:p>
     <w:p>
@@ -500,55 +288,7 @@
           <w:lang w:eastAsia="en-GB"/>
           <w14:ligatures w14:val="none"/>
         </w:rPr>
-        <w:t xml:space="preserve">Deep expertise in </w:t>
-      </w:r>
-      <w:proofErr w:type="spellStart"/>
-      <w:r>
-        <w:rPr>
-          <w:rFonts w:ascii="Century Gothic" w:eastAsia="Times New Roman" w:hAnsi="Century Gothic" w:cs="Times New Roman"/>
-          <w:kern w:val="0"/>
-          <w:sz w:val="15"/>
-          <w:szCs w:val="15"/>
-          <w:lang w:eastAsia="en-GB"/>
-          <w14:ligatures w14:val="none"/>
-        </w:rPr>
-        <w:t>MLOps</w:t>
-      </w:r>
-      <w:proofErr w:type="spellEnd"/>
-      <w:r>
-        <w:rPr>
-          <w:rFonts w:ascii="Century Gothic" w:eastAsia="Times New Roman" w:hAnsi="Century Gothic" w:cs="Times New Roman"/>
-          <w:kern w:val="0"/>
-          <w:sz w:val="15"/>
-          <w:szCs w:val="15"/>
-          <w:lang w:eastAsia="en-GB"/>
-          <w14:ligatures w14:val="none"/>
-        </w:rPr>
-        <w:t xml:space="preserve"> and </w:t>
-      </w:r>
-      <w:proofErr w:type="spellStart"/>
-      <w:r>
-        <w:rPr>
-          <w:rFonts w:ascii="Century Gothic" w:eastAsia="Times New Roman" w:hAnsi="Century Gothic" w:cs="Times New Roman"/>
-          <w:kern w:val="0"/>
-          <w:sz w:val="15"/>
-          <w:szCs w:val="15"/>
-          <w:lang w:eastAsia="en-GB"/>
-          <w14:ligatures w14:val="none"/>
-        </w:rPr>
-        <w:t>LLMOps</w:t>
-      </w:r>
-      <w:proofErr w:type="spellEnd"/>
-      <w:r>
-        <w:rPr>
-          <w:rFonts w:ascii="Century Gothic" w:eastAsia="Times New Roman" w:hAnsi="Century Gothic" w:cs="Times New Roman"/>
-          <w:kern w:val="0"/>
-          <w:sz w:val="15"/>
-          <w:szCs w:val="15"/>
-          <w:lang w:eastAsia="en-GB"/>
-          <w14:ligatures w14:val="none"/>
-        </w:rPr>
-        <w:t xml:space="preserve"> using MLflow, SageMaker, Vertex AI, Triton Inference Server, Docker, Kubernetes, and CI/CD workflows, ensuring model reliability, governance, responsible AI compliance, and A/B testing at enterprise scale.</w:t>
+        <w:t xml:space="preserve">Deep expertise in containerized deployment and MLOps/LLMOps, using Docker, Kubernetes, FastAPI microservices, MLflow, SageMaker, and CI/CD pipelines to ship reliable full-stack AI services with model governance and responsible AI compliance at enterprise scale.</w:t>
       </w:r>
     </w:p>
     <w:p>
@@ -625,15 +365,15 @@
           <w:sz w:val="15"/>
           <w:szCs w:val="15"/>
         </w:rPr>
-        <w:t>Programming &amp; Scripting:</w:t>
-      </w:r>
-      <w:r>
-        <w:rPr>
-          <w:rFonts w:ascii="Century Gothic" w:hAnsi="Century Gothic"/>
-          <w:sz w:val="15"/>
-          <w:szCs w:val="15"/>
-        </w:rPr>
-        <w:t xml:space="preserve"> Python, SQL, JavaScript</w:t>
+        <w:t>Languages:</w:t>
+      </w:r>
+      <w:r>
+        <w:rPr>
+          <w:rFonts w:ascii="Century Gothic" w:hAnsi="Century Gothic"/>
+          <w:sz w:val="15"/>
+          <w:szCs w:val="15"/>
+        </w:rPr>
+        <w:t xml:space="preserve"> Python, JavaScript, SQL</w:t>
       </w:r>
     </w:p>
     <w:p>
@@ -654,105 +394,15 @@
           <w:sz w:val="15"/>
           <w:szCs w:val="15"/>
         </w:rPr>
-        <w:t>Large Language Models &amp; Deep Learning:</w:t>
-      </w:r>
-      <w:r>
-        <w:rPr>
-          <w:rFonts w:ascii="Century Gothic" w:hAnsi="Century Gothic"/>
-          <w:sz w:val="15"/>
-          <w:szCs w:val="15"/>
-        </w:rPr>
-        <w:t xml:space="preserve"> </w:t>
-      </w:r>
-      <w:proofErr w:type="spellStart"/>
-      <w:r>
-        <w:rPr>
-          <w:rFonts w:ascii="Century Gothic" w:hAnsi="Century Gothic"/>
-          <w:sz w:val="15"/>
-          <w:szCs w:val="15"/>
-        </w:rPr>
-        <w:t>PyTorch</w:t>
-      </w:r>
-      <w:proofErr w:type="spellEnd"/>
-      <w:r>
-        <w:rPr>
-          <w:rFonts w:ascii="Century Gothic" w:hAnsi="Century Gothic"/>
-          <w:sz w:val="15"/>
-          <w:szCs w:val="15"/>
-        </w:rPr>
-        <w:t xml:space="preserve">, TensorFlow, </w:t>
-      </w:r>
-      <w:proofErr w:type="spellStart"/>
-      <w:r>
-        <w:rPr>
-          <w:rFonts w:ascii="Century Gothic" w:hAnsi="Century Gothic"/>
-          <w:sz w:val="15"/>
-          <w:szCs w:val="15"/>
-        </w:rPr>
-        <w:t>Keras</w:t>
-      </w:r>
-      <w:proofErr w:type="spellEnd"/>
-      <w:r>
-        <w:rPr>
-          <w:rFonts w:ascii="Century Gothic" w:hAnsi="Century Gothic"/>
-          <w:sz w:val="15"/>
-          <w:szCs w:val="15"/>
-        </w:rPr>
-        <w:t xml:space="preserve">, JAX, Hugging Face Transformers, GPT-4o, BERT, T5, CLIP, </w:t>
-      </w:r>
-      <w:proofErr w:type="spellStart"/>
-      <w:r>
-        <w:rPr>
-          <w:rFonts w:ascii="Century Gothic" w:hAnsi="Century Gothic"/>
-          <w:sz w:val="15"/>
-          <w:szCs w:val="15"/>
-        </w:rPr>
-        <w:t>LLaMA</w:t>
-      </w:r>
-      <w:proofErr w:type="spellEnd"/>
-      <w:r>
-        <w:rPr>
-          <w:rFonts w:ascii="Century Gothic" w:hAnsi="Century Gothic"/>
-          <w:sz w:val="15"/>
-          <w:szCs w:val="15"/>
-        </w:rPr>
-        <w:t xml:space="preserve">, Mistral, Gemini, Diffusion Models, GANs, VAEs, </w:t>
-      </w:r>
-      <w:proofErr w:type="spellStart"/>
-      <w:r>
-        <w:rPr>
-          <w:rFonts w:ascii="Century Gothic" w:hAnsi="Century Gothic"/>
-          <w:sz w:val="15"/>
-          <w:szCs w:val="15"/>
-        </w:rPr>
-        <w:t>LoRA</w:t>
-      </w:r>
-      <w:proofErr w:type="spellEnd"/>
-      <w:r>
-        <w:rPr>
-          <w:rFonts w:ascii="Century Gothic" w:hAnsi="Century Gothic"/>
-          <w:sz w:val="15"/>
-          <w:szCs w:val="15"/>
-        </w:rPr>
-        <w:t xml:space="preserve">, </w:t>
-      </w:r>
-      <w:proofErr w:type="spellStart"/>
-      <w:r>
-        <w:rPr>
-          <w:rFonts w:ascii="Century Gothic" w:hAnsi="Century Gothic"/>
-          <w:sz w:val="15"/>
-          <w:szCs w:val="15"/>
-        </w:rPr>
-        <w:t>QLoRA</w:t>
-      </w:r>
-      <w:proofErr w:type="spellEnd"/>
-      <w:r>
-        <w:rPr>
-          <w:rFonts w:ascii="Century Gothic" w:hAnsi="Century Gothic"/>
-          <w:sz w:val="15"/>
-          <w:szCs w:val="15"/>
-        </w:rPr>
-        <w:t>, PEFT, Multimodal Models, Computer Vision, NLP, Speech Recognition</w:t>
+        <w:t>Machine Learning &amp; Deep Learning:</w:t>
+      </w:r>
+      <w:r>
+        <w:rPr>
+          <w:rFonts w:ascii="Century Gothic" w:hAnsi="Century Gothic"/>
+          <w:sz w:val="15"/>
+          <w:szCs w:val="15"/>
+        </w:rPr>
+        <w:t xml:space="preserve"> PyTorch, TensorFlow, Hugging Face Transformers</w:t>
       </w:r>
     </w:p>
     <w:p>
@@ -773,69 +423,15 @@
           <w:sz w:val="15"/>
           <w:szCs w:val="15"/>
         </w:rPr>
-        <w:t>Generative AI &amp; Prompt Engineering:</w:t>
-      </w:r>
-      <w:r>
-        <w:rPr>
-          <w:rFonts w:ascii="Century Gothic" w:hAnsi="Century Gothic"/>
-          <w:sz w:val="15"/>
-          <w:szCs w:val="15"/>
-        </w:rPr>
-        <w:t xml:space="preserve"> OpenAI API, LangChain, </w:t>
-      </w:r>
-      <w:proofErr w:type="spellStart"/>
-      <w:r>
-        <w:rPr>
-          <w:rFonts w:ascii="Century Gothic" w:hAnsi="Century Gothic"/>
-          <w:sz w:val="15"/>
-          <w:szCs w:val="15"/>
-        </w:rPr>
-        <w:t>LangGraph</w:t>
-      </w:r>
-      <w:proofErr w:type="spellEnd"/>
-      <w:r>
-        <w:rPr>
-          <w:rFonts w:ascii="Century Gothic" w:hAnsi="Century Gothic"/>
-          <w:sz w:val="15"/>
-          <w:szCs w:val="15"/>
-        </w:rPr>
-        <w:t xml:space="preserve">, </w:t>
-      </w:r>
-      <w:proofErr w:type="spellStart"/>
-      <w:r>
-        <w:rPr>
-          <w:rFonts w:ascii="Century Gothic" w:hAnsi="Century Gothic"/>
-          <w:sz w:val="15"/>
-          <w:szCs w:val="15"/>
-        </w:rPr>
-        <w:t>LlamaIndex</w:t>
-      </w:r>
-      <w:proofErr w:type="spellEnd"/>
-      <w:r>
-        <w:rPr>
-          <w:rFonts w:ascii="Century Gothic" w:hAnsi="Century Gothic"/>
-          <w:sz w:val="15"/>
-          <w:szCs w:val="15"/>
-        </w:rPr>
-        <w:t xml:space="preserve">, Cohere, Anthropic Claude, AWS Bedrock, Azure OpenAI, </w:t>
-      </w:r>
-      <w:proofErr w:type="spellStart"/>
-      <w:r>
-        <w:rPr>
-          <w:rFonts w:ascii="Century Gothic" w:hAnsi="Century Gothic"/>
-          <w:sz w:val="15"/>
-          <w:szCs w:val="15"/>
-        </w:rPr>
-        <w:t>DreamBooth</w:t>
-      </w:r>
-      <w:proofErr w:type="spellEnd"/>
-      <w:r>
-        <w:rPr>
-          <w:rFonts w:ascii="Century Gothic" w:hAnsi="Century Gothic"/>
-          <w:sz w:val="15"/>
-          <w:szCs w:val="15"/>
-        </w:rPr>
-        <w:t>, Zero-shot/Few-shot Prompting, Chain-of-Thought, Retrieval-Augmented Generation (RAG), Multi-Agent Systems, Agentic AI, Function Calling, System Prompt Design, Multimodal AI, Fine-tuning</w:t>
+        <w:t>Generative AI &amp; LLMs:</w:t>
+      </w:r>
+      <w:r>
+        <w:rPr>
+          <w:rFonts w:ascii="Century Gothic" w:hAnsi="Century Gothic"/>
+          <w:sz w:val="15"/>
+          <w:szCs w:val="15"/>
+        </w:rPr>
+        <w:t xml:space="preserve"> LangChain, LangGraph, LlamaIndex, Model Context Protocol (MCP), OpenAI GPT-5/GPT-4o, Anthropic Claude, Google Gemini, LLaMA/Mistral fine-tuning (LoRA/QLoRA), Retrieval-Augmented Generation (RAG), Multi-Agent Systems (AutoGen, CrewAI)</w:t>
       </w:r>
     </w:p>
     <w:p>
@@ -849,7 +445,6 @@
           <w:szCs w:val="15"/>
         </w:rPr>
       </w:pPr>
-      <w:proofErr w:type="spellStart"/>
       <w:r>
         <w:rPr>
           <w:rStyle w:val="Strong"/>
@@ -857,79 +452,15 @@
           <w:sz w:val="15"/>
           <w:szCs w:val="15"/>
         </w:rPr>
-        <w:t>MLOps</w:t>
-      </w:r>
-      <w:proofErr w:type="spellEnd"/>
-      <w:r>
-        <w:rPr>
-          <w:rStyle w:val="Strong"/>
-          <w:rFonts w:ascii="Century Gothic" w:eastAsiaTheme="majorEastAsia" w:hAnsi="Century Gothic"/>
-          <w:sz w:val="15"/>
-          <w:szCs w:val="15"/>
-        </w:rPr>
-        <w:t xml:space="preserve"> &amp; Model Lifecycle:</w:t>
-      </w:r>
-      <w:r>
-        <w:rPr>
-          <w:rFonts w:ascii="Century Gothic" w:hAnsi="Century Gothic"/>
-          <w:sz w:val="15"/>
-          <w:szCs w:val="15"/>
-        </w:rPr>
-        <w:t xml:space="preserve"> MLflow, </w:t>
-      </w:r>
-      <w:proofErr w:type="spellStart"/>
-      <w:r>
-        <w:rPr>
-          <w:rFonts w:ascii="Century Gothic" w:hAnsi="Century Gothic"/>
-          <w:sz w:val="15"/>
-          <w:szCs w:val="15"/>
-        </w:rPr>
-        <w:t>KServe</w:t>
-      </w:r>
-      <w:proofErr w:type="spellEnd"/>
-      <w:r>
-        <w:rPr>
-          <w:rFonts w:ascii="Century Gothic" w:hAnsi="Century Gothic"/>
-          <w:sz w:val="15"/>
-          <w:szCs w:val="15"/>
-        </w:rPr>
-        <w:t xml:space="preserve">, SageMaker, Vertex AI, Azure ML, DVC, Weights &amp; Biases, Kubeflow, Triton Inference Server, </w:t>
-      </w:r>
-      <w:proofErr w:type="spellStart"/>
-      <w:r>
-        <w:rPr>
-          <w:rFonts w:ascii="Century Gothic" w:hAnsi="Century Gothic"/>
-          <w:sz w:val="15"/>
-          <w:szCs w:val="15"/>
-        </w:rPr>
-        <w:t>TorchServe</w:t>
-      </w:r>
-      <w:proofErr w:type="spellEnd"/>
-      <w:r>
-        <w:rPr>
-          <w:rFonts w:ascii="Century Gothic" w:hAnsi="Century Gothic"/>
-          <w:sz w:val="15"/>
-          <w:szCs w:val="15"/>
-        </w:rPr>
-        <w:t xml:space="preserve">, Ray, CI/CD (Jenkins, GitHub Actions), </w:t>
-      </w:r>
-      <w:proofErr w:type="spellStart"/>
-      <w:r>
-        <w:rPr>
-          <w:rFonts w:ascii="Century Gothic" w:hAnsi="Century Gothic"/>
-          <w:sz w:val="15"/>
-          <w:szCs w:val="15"/>
-        </w:rPr>
-        <w:t>LLMOps</w:t>
-      </w:r>
-      <w:proofErr w:type="spellEnd"/>
-      <w:r>
-        <w:rPr>
-          <w:rFonts w:ascii="Century Gothic" w:hAnsi="Century Gothic"/>
-          <w:sz w:val="15"/>
-          <w:szCs w:val="15"/>
-        </w:rPr>
-        <w:t>, Model Governance, A/B Testing, Data Drift Monitoring, Hallucination Reduction</w:t>
+        <w:t>Full-Stack Development &amp; APIs:</w:t>
+      </w:r>
+      <w:r>
+        <w:rPr>
+          <w:rFonts w:ascii="Century Gothic" w:hAnsi="Century Gothic"/>
+          <w:sz w:val="15"/>
+          <w:szCs w:val="15"/>
+        </w:rPr>
+        <w:t xml:space="preserve"> FastAPI, Flask, REST &amp; GraphQL APIs, Microservices Architecture, Docker, Kubernetes, AI-Assisted Development (GitHub Copilot, Claude Code)</w:t>
       </w:r>
     </w:p>
     <w:p>
@@ -950,51 +481,15 @@
           <w:sz w:val="15"/>
           <w:szCs w:val="15"/>
         </w:rPr>
-        <w:t>Data Engineering &amp; Pipelines:</w:t>
-      </w:r>
-      <w:r>
-        <w:rPr>
-          <w:rFonts w:ascii="Century Gothic" w:hAnsi="Century Gothic"/>
-          <w:sz w:val="15"/>
-          <w:szCs w:val="15"/>
-        </w:rPr>
-        <w:t xml:space="preserve"> Apache Kafka, Apache Spark, Apache Airflow, BigQuery, Snowflake, Apache </w:t>
-      </w:r>
-      <w:proofErr w:type="spellStart"/>
-      <w:r>
-        <w:rPr>
-          <w:rFonts w:ascii="Century Gothic" w:hAnsi="Century Gothic"/>
-          <w:sz w:val="15"/>
-          <w:szCs w:val="15"/>
-        </w:rPr>
-        <w:t>NiFi</w:t>
-      </w:r>
-      <w:proofErr w:type="spellEnd"/>
-      <w:r>
-        <w:rPr>
-          <w:rFonts w:ascii="Century Gothic" w:hAnsi="Century Gothic"/>
-          <w:sz w:val="15"/>
-          <w:szCs w:val="15"/>
-        </w:rPr>
-        <w:t xml:space="preserve">, Apache Flink, </w:t>
-      </w:r>
-      <w:proofErr w:type="spellStart"/>
-      <w:r>
-        <w:rPr>
-          <w:rFonts w:ascii="Century Gothic" w:hAnsi="Century Gothic"/>
-          <w:sz w:val="15"/>
-          <w:szCs w:val="15"/>
-        </w:rPr>
-        <w:t>dbt</w:t>
-      </w:r>
-      <w:proofErr w:type="spellEnd"/>
-      <w:r>
-        <w:rPr>
-          <w:rFonts w:ascii="Century Gothic" w:hAnsi="Century Gothic"/>
-          <w:sz w:val="15"/>
-          <w:szCs w:val="15"/>
-        </w:rPr>
-        <w:t>, Delta Lake, Databricks, Redshift, ETL/ELT Pipelines, Timeseries Data, Distributed Computing</w:t>
+        <w:t>Cloud &amp; MLOps:</w:t>
+      </w:r>
+      <w:r>
+        <w:rPr>
+          <w:rFonts w:ascii="Century Gothic" w:hAnsi="Century Gothic"/>
+          <w:sz w:val="15"/>
+          <w:szCs w:val="15"/>
+        </w:rPr>
+        <w:t xml:space="preserve"> AWS (SageMaker, Bedrock, EC2, EKS), Azure, GCP Vertex AI, MLflow, Kubeflow, Triton Inference Server, vLLM, Terraform, CI/CD (Jenkins, GitHub Actions)</w:t>
       </w:r>
     </w:p>
     <w:p>
@@ -1015,69 +510,15 @@
           <w:sz w:val="15"/>
           <w:szCs w:val="15"/>
         </w:rPr>
-        <w:t>Vector Databases &amp; Embedding Stores:</w:t>
-      </w:r>
-      <w:r>
-        <w:rPr>
-          <w:rFonts w:ascii="Century Gothic" w:hAnsi="Century Gothic"/>
-          <w:sz w:val="15"/>
-          <w:szCs w:val="15"/>
-        </w:rPr>
-        <w:t xml:space="preserve"> FAISS, Pinecone, </w:t>
-      </w:r>
-      <w:proofErr w:type="spellStart"/>
-      <w:r>
-        <w:rPr>
-          <w:rFonts w:ascii="Century Gothic" w:hAnsi="Century Gothic"/>
-          <w:sz w:val="15"/>
-          <w:szCs w:val="15"/>
-        </w:rPr>
-        <w:t>Weaviate</w:t>
-      </w:r>
-      <w:proofErr w:type="spellEnd"/>
-      <w:r>
-        <w:rPr>
-          <w:rFonts w:ascii="Century Gothic" w:hAnsi="Century Gothic"/>
-          <w:sz w:val="15"/>
-          <w:szCs w:val="15"/>
-        </w:rPr>
-        <w:t xml:space="preserve">, </w:t>
-      </w:r>
-      <w:proofErr w:type="spellStart"/>
-      <w:r>
-        <w:rPr>
-          <w:rFonts w:ascii="Century Gothic" w:hAnsi="Century Gothic"/>
-          <w:sz w:val="15"/>
-          <w:szCs w:val="15"/>
-        </w:rPr>
-        <w:t>ChromaDB</w:t>
-      </w:r>
-      <w:proofErr w:type="spellEnd"/>
-      <w:r>
-        <w:rPr>
-          <w:rFonts w:ascii="Century Gothic" w:hAnsi="Century Gothic"/>
-          <w:sz w:val="15"/>
-          <w:szCs w:val="15"/>
-        </w:rPr>
-        <w:t xml:space="preserve">, Milvus, </w:t>
-      </w:r>
-      <w:proofErr w:type="spellStart"/>
-      <w:r>
-        <w:rPr>
-          <w:rFonts w:ascii="Century Gothic" w:hAnsi="Century Gothic"/>
-          <w:sz w:val="15"/>
-          <w:szCs w:val="15"/>
-        </w:rPr>
-        <w:t>pgvector</w:t>
-      </w:r>
-      <w:proofErr w:type="spellEnd"/>
-      <w:r>
-        <w:rPr>
-          <w:rFonts w:ascii="Century Gothic" w:hAnsi="Century Gothic"/>
-          <w:sz w:val="15"/>
-          <w:szCs w:val="15"/>
-        </w:rPr>
-        <w:t>, Elasticsearch, Embedding Pipelines, Semantic Search, Vector Indexing</w:t>
+        <w:t>Data Engineering &amp; Vector Search:</w:t>
+      </w:r>
+      <w:r>
+        <w:rPr>
+          <w:rFonts w:ascii="Century Gothic" w:hAnsi="Century Gothic"/>
+          <w:sz w:val="15"/>
+          <w:szCs w:val="15"/>
+        </w:rPr>
+        <w:t xml:space="preserve"> Apache Kafka, Apache Spark, Apache Airflow, Apache Flink, Snowflake, FAISS, Pinecone, Weaviate</w:t>
       </w:r>
     </w:p>
     <w:p>
@@ -1098,87 +539,15 @@
           <w:sz w:val="15"/>
           <w:szCs w:val="15"/>
         </w:rPr>
-        <w:t>Model Deployment &amp; Serving:</w:t>
-      </w:r>
-      <w:r>
-        <w:rPr>
-          <w:rFonts w:ascii="Century Gothic" w:hAnsi="Century Gothic"/>
-          <w:sz w:val="15"/>
-          <w:szCs w:val="15"/>
-        </w:rPr>
-        <w:t xml:space="preserve"> Docker, Kubernetes, ONNX, </w:t>
-      </w:r>
-      <w:proofErr w:type="spellStart"/>
-      <w:r>
-        <w:rPr>
-          <w:rFonts w:ascii="Century Gothic" w:hAnsi="Century Gothic"/>
-          <w:sz w:val="15"/>
-          <w:szCs w:val="15"/>
-        </w:rPr>
-        <w:t>TensorRT</w:t>
-      </w:r>
-      <w:proofErr w:type="spellEnd"/>
-      <w:r>
-        <w:rPr>
-          <w:rFonts w:ascii="Century Gothic" w:hAnsi="Century Gothic"/>
-          <w:sz w:val="15"/>
-          <w:szCs w:val="15"/>
-        </w:rPr>
-        <w:t xml:space="preserve">, </w:t>
-      </w:r>
-      <w:proofErr w:type="spellStart"/>
-      <w:r>
-        <w:rPr>
-          <w:rFonts w:ascii="Century Gothic" w:hAnsi="Century Gothic"/>
-          <w:sz w:val="15"/>
-          <w:szCs w:val="15"/>
-        </w:rPr>
-        <w:t>FastAPI</w:t>
-      </w:r>
-      <w:proofErr w:type="spellEnd"/>
-      <w:r>
-        <w:rPr>
-          <w:rFonts w:ascii="Century Gothic" w:hAnsi="Century Gothic"/>
-          <w:sz w:val="15"/>
-          <w:szCs w:val="15"/>
-        </w:rPr>
-        <w:t xml:space="preserve">, Flask, REST APIs, </w:t>
-      </w:r>
-      <w:proofErr w:type="spellStart"/>
-      <w:r>
-        <w:rPr>
-          <w:rFonts w:ascii="Century Gothic" w:hAnsi="Century Gothic"/>
-          <w:sz w:val="15"/>
-          <w:szCs w:val="15"/>
-        </w:rPr>
-        <w:t>GraphQL</w:t>
-      </w:r>
-      <w:proofErr w:type="spellEnd"/>
-      <w:r>
-        <w:rPr>
-          <w:rFonts w:ascii="Century Gothic" w:hAnsi="Century Gothic"/>
-          <w:sz w:val="15"/>
-          <w:szCs w:val="15"/>
-        </w:rPr>
-        <w:t xml:space="preserve">, </w:t>
-      </w:r>
-      <w:proofErr w:type="spellStart"/>
-      <w:r>
-        <w:rPr>
-          <w:rFonts w:ascii="Century Gothic" w:hAnsi="Century Gothic"/>
-          <w:sz w:val="15"/>
-          <w:szCs w:val="15"/>
-        </w:rPr>
-        <w:t>gRPC</w:t>
-      </w:r>
-      <w:proofErr w:type="spellEnd"/>
-      <w:r>
-        <w:rPr>
-          <w:rFonts w:ascii="Century Gothic" w:hAnsi="Century Gothic"/>
-          <w:sz w:val="15"/>
-          <w:szCs w:val="15"/>
-        </w:rPr>
-        <w:t>, Model Quantization, Knowledge Distillation, Inference Optimization, Model Compression, GPU Acceleration, AWS Lambda, Edge Deployment</w:t>
+        <w:t>Monitoring &amp; Explainability:</w:t>
+      </w:r>
+      <w:r>
+        <w:rPr>
+          <w:rFonts w:ascii="Century Gothic" w:hAnsi="Century Gothic"/>
+          <w:sz w:val="15"/>
+          <w:szCs w:val="15"/>
+        </w:rPr>
+        <w:t xml:space="preserve"> Prometheus, ELK Stack, SHAP, LIME, Fairlearn</w:t>
       </w:r>
     </w:p>
     <w:p>
@@ -1199,397 +568,15 @@
           <w:sz w:val="15"/>
           <w:szCs w:val="15"/>
         </w:rPr>
-        <w:t>Cloud Platforms &amp; Infrastructure:</w:t>
-      </w:r>
-      <w:r>
-        <w:rPr>
-          <w:rFonts w:ascii="Century Gothic" w:hAnsi="Century Gothic"/>
-          <w:sz w:val="15"/>
-          <w:szCs w:val="15"/>
-        </w:rPr>
-        <w:t xml:space="preserve"> AWS (SageMaker, Bedrock, EC2, S3, Lambda, EKS), Azure (Azure ML, Azure OpenAI, AKS), Terraform, Helm, </w:t>
-      </w:r>
-      <w:proofErr w:type="spellStart"/>
-      <w:r>
-        <w:rPr>
-          <w:rFonts w:ascii="Century Gothic" w:hAnsi="Century Gothic"/>
-          <w:sz w:val="15"/>
-          <w:szCs w:val="15"/>
-        </w:rPr>
-        <w:t>Pulumi</w:t>
-      </w:r>
-      <w:proofErr w:type="spellEnd"/>
-      <w:r>
-        <w:rPr>
-          <w:rFonts w:ascii="Century Gothic" w:hAnsi="Century Gothic"/>
-          <w:sz w:val="15"/>
-          <w:szCs w:val="15"/>
-        </w:rPr>
-        <w:t>, Cloud Cost Optimization, Distributed Training</w:t>
-      </w:r>
-    </w:p>
-    <w:p>
-      <w:pPr>
-        <w:pStyle w:val="NormalWeb"/>
-        <w:spacing w:before="24" w:beforeAutospacing="0" w:after="24" w:afterAutospacing="0"/>
-        <w:jc w:val="both"/>
-        <w:rPr>
-          <w:rFonts w:ascii="Century Gothic" w:hAnsi="Century Gothic"/>
-          <w:sz w:val="15"/>
-          <w:szCs w:val="15"/>
-        </w:rPr>
-      </w:pPr>
-      <w:r>
-        <w:rPr>
-          <w:rStyle w:val="Strong"/>
-          <w:rFonts w:ascii="Century Gothic" w:eastAsiaTheme="majorEastAsia" w:hAnsi="Century Gothic"/>
-          <w:sz w:val="15"/>
-          <w:szCs w:val="15"/>
-        </w:rPr>
-        <w:t>Monitoring &amp; Observability:</w:t>
-      </w:r>
-      <w:r>
-        <w:rPr>
-          <w:rFonts w:ascii="Century Gothic" w:hAnsi="Century Gothic"/>
-          <w:sz w:val="15"/>
-          <w:szCs w:val="15"/>
-        </w:rPr>
-        <w:t xml:space="preserve"> Prometheus, Grafana, ELK Stack, </w:t>
-      </w:r>
-      <w:proofErr w:type="spellStart"/>
-      <w:r>
-        <w:rPr>
-          <w:rFonts w:ascii="Century Gothic" w:hAnsi="Century Gothic"/>
-          <w:sz w:val="15"/>
-          <w:szCs w:val="15"/>
-        </w:rPr>
-        <w:t>OpenTelemetry</w:t>
-      </w:r>
-      <w:proofErr w:type="spellEnd"/>
-    </w:p>
-    <w:p>
-      <w:pPr>
-        <w:pStyle w:val="NormalWeb"/>
-        <w:spacing w:before="24" w:beforeAutospacing="0" w:after="24" w:afterAutospacing="0"/>
-        <w:jc w:val="both"/>
-        <w:rPr>
-          <w:rFonts w:ascii="Century Gothic" w:hAnsi="Century Gothic"/>
-          <w:sz w:val="15"/>
-          <w:szCs w:val="15"/>
-        </w:rPr>
-      </w:pPr>
-      <w:r>
-        <w:rPr>
-          <w:rStyle w:val="Strong"/>
-          <w:rFonts w:ascii="Century Gothic" w:eastAsiaTheme="majorEastAsia" w:hAnsi="Century Gothic"/>
-          <w:sz w:val="15"/>
-          <w:szCs w:val="15"/>
-        </w:rPr>
-        <w:t>Visualization &amp; UI Tools:</w:t>
-      </w:r>
-      <w:r>
-        <w:rPr>
-          <w:rFonts w:ascii="Century Gothic" w:hAnsi="Century Gothic"/>
-          <w:sz w:val="15"/>
-          <w:szCs w:val="15"/>
-        </w:rPr>
-        <w:t xml:space="preserve"> </w:t>
-      </w:r>
-      <w:proofErr w:type="spellStart"/>
-      <w:r>
-        <w:rPr>
-          <w:rFonts w:ascii="Century Gothic" w:hAnsi="Century Gothic"/>
-          <w:sz w:val="15"/>
-          <w:szCs w:val="15"/>
-        </w:rPr>
-        <w:t>Streamlit</w:t>
-      </w:r>
-      <w:proofErr w:type="spellEnd"/>
-      <w:r>
-        <w:rPr>
-          <w:rFonts w:ascii="Century Gothic" w:hAnsi="Century Gothic"/>
-          <w:sz w:val="15"/>
-          <w:szCs w:val="15"/>
-        </w:rPr>
-        <w:t xml:space="preserve">, </w:t>
-      </w:r>
-      <w:proofErr w:type="spellStart"/>
-      <w:r>
-        <w:rPr>
-          <w:rFonts w:ascii="Century Gothic" w:hAnsi="Century Gothic"/>
-          <w:sz w:val="15"/>
-          <w:szCs w:val="15"/>
-        </w:rPr>
-        <w:t>Gradio</w:t>
-      </w:r>
-      <w:proofErr w:type="spellEnd"/>
-      <w:r>
-        <w:rPr>
-          <w:rFonts w:ascii="Century Gothic" w:hAnsi="Century Gothic"/>
-          <w:sz w:val="15"/>
-          <w:szCs w:val="15"/>
-        </w:rPr>
-        <w:t xml:space="preserve">, Dash, </w:t>
-      </w:r>
-      <w:proofErr w:type="spellStart"/>
-      <w:r>
-        <w:rPr>
-          <w:rFonts w:ascii="Century Gothic" w:hAnsi="Century Gothic"/>
-          <w:sz w:val="15"/>
-          <w:szCs w:val="15"/>
-        </w:rPr>
-        <w:t>Jupyter</w:t>
-      </w:r>
-      <w:proofErr w:type="spellEnd"/>
-      <w:r>
-        <w:rPr>
-          <w:rFonts w:ascii="Century Gothic" w:hAnsi="Century Gothic"/>
-          <w:sz w:val="15"/>
-          <w:szCs w:val="15"/>
-        </w:rPr>
-        <w:t xml:space="preserve"> Notebooks, Power BI, Looker</w:t>
-      </w:r>
-    </w:p>
-    <w:p>
-      <w:pPr>
-        <w:pStyle w:val="NormalWeb"/>
-        <w:spacing w:before="24" w:beforeAutospacing="0" w:after="24" w:afterAutospacing="0"/>
-        <w:jc w:val="both"/>
-        <w:rPr>
-          <w:rFonts w:ascii="Century Gothic" w:hAnsi="Century Gothic"/>
-          <w:sz w:val="15"/>
-          <w:szCs w:val="15"/>
-        </w:rPr>
-      </w:pPr>
-      <w:r>
-        <w:rPr>
-          <w:rStyle w:val="Strong"/>
-          <w:rFonts w:ascii="Century Gothic" w:eastAsiaTheme="majorEastAsia" w:hAnsi="Century Gothic"/>
-          <w:sz w:val="15"/>
-          <w:szCs w:val="15"/>
-        </w:rPr>
-        <w:t>Security &amp; Responsible AI:</w:t>
-      </w:r>
-      <w:r>
-        <w:rPr>
-          <w:rFonts w:ascii="Century Gothic" w:hAnsi="Century Gothic"/>
-          <w:sz w:val="15"/>
-          <w:szCs w:val="15"/>
-        </w:rPr>
-        <w:t xml:space="preserve"> Apache Ranger, DLP APIs, Federated Learning, Differential Privacy, </w:t>
-      </w:r>
-      <w:proofErr w:type="spellStart"/>
-      <w:r>
-        <w:rPr>
-          <w:rFonts w:ascii="Century Gothic" w:hAnsi="Century Gothic"/>
-          <w:sz w:val="15"/>
-          <w:szCs w:val="15"/>
-        </w:rPr>
-        <w:t>Fairlearn</w:t>
-      </w:r>
-      <w:proofErr w:type="spellEnd"/>
-      <w:r>
-        <w:rPr>
-          <w:rFonts w:ascii="Century Gothic" w:hAnsi="Century Gothic"/>
-          <w:sz w:val="15"/>
-          <w:szCs w:val="15"/>
-        </w:rPr>
-        <w:t>, SHAP, LIME, Responsible AI Standards, RLHF, RLAIF, AI Safety, Bias Detection, Model Explainability, Regulatory Compliance, PII Redaction</w:t>
-      </w:r>
-    </w:p>
-    <w:p>
-      <w:pPr>
-        <w:pStyle w:val="NormalWeb"/>
-        <w:spacing w:before="24" w:beforeAutospacing="0" w:after="24" w:afterAutospacing="0"/>
-        <w:jc w:val="both"/>
-        <w:rPr>
-          <w:rFonts w:ascii="Century Gothic" w:hAnsi="Century Gothic"/>
-          <w:sz w:val="15"/>
-          <w:szCs w:val="15"/>
-        </w:rPr>
-      </w:pPr>
-      <w:r>
-        <w:rPr>
-          <w:rStyle w:val="Strong"/>
-          <w:rFonts w:ascii="Century Gothic" w:eastAsiaTheme="majorEastAsia" w:hAnsi="Century Gothic"/>
-          <w:sz w:val="15"/>
-          <w:szCs w:val="15"/>
-        </w:rPr>
-        <w:t>Graph &amp; Knowledge Systems:</w:t>
-      </w:r>
-      <w:r>
-        <w:rPr>
-          <w:rFonts w:ascii="Century Gothic" w:hAnsi="Century Gothic"/>
-          <w:sz w:val="15"/>
-          <w:szCs w:val="15"/>
-        </w:rPr>
-        <w:t xml:space="preserve"> Neo4j, RDF, SPARQL, Knowledge Graphs, Graph Neural Networks (GNN)</w:t>
-      </w:r>
-    </w:p>
-    <w:p>
-      <w:pPr>
-        <w:pStyle w:val="NormalWeb"/>
-        <w:spacing w:before="24" w:beforeAutospacing="0" w:after="24" w:afterAutospacing="0"/>
-        <w:jc w:val="both"/>
-        <w:rPr>
-          <w:rFonts w:ascii="Century Gothic" w:hAnsi="Century Gothic"/>
-          <w:sz w:val="15"/>
-          <w:szCs w:val="15"/>
-        </w:rPr>
-      </w:pPr>
-      <w:r>
-        <w:rPr>
-          <w:rStyle w:val="Strong"/>
-          <w:rFonts w:ascii="Century Gothic" w:eastAsiaTheme="majorEastAsia" w:hAnsi="Century Gothic"/>
-          <w:sz w:val="15"/>
-          <w:szCs w:val="15"/>
-        </w:rPr>
-        <w:t>AI Frameworks &amp; Agentic Systems:</w:t>
-      </w:r>
-      <w:r>
-        <w:rPr>
-          <w:rFonts w:ascii="Century Gothic" w:hAnsi="Century Gothic"/>
-          <w:sz w:val="15"/>
-          <w:szCs w:val="15"/>
-        </w:rPr>
-        <w:t xml:space="preserve"> </w:t>
-      </w:r>
-      <w:proofErr w:type="spellStart"/>
-      <w:r>
-        <w:rPr>
-          <w:rFonts w:ascii="Century Gothic" w:hAnsi="Century Gothic"/>
-          <w:sz w:val="15"/>
-          <w:szCs w:val="15"/>
-        </w:rPr>
-        <w:t>AutoGen</w:t>
-      </w:r>
-      <w:proofErr w:type="spellEnd"/>
-      <w:r>
-        <w:rPr>
-          <w:rFonts w:ascii="Century Gothic" w:hAnsi="Century Gothic"/>
-          <w:sz w:val="15"/>
-          <w:szCs w:val="15"/>
-        </w:rPr>
-        <w:t xml:space="preserve">, </w:t>
-      </w:r>
-      <w:proofErr w:type="spellStart"/>
-      <w:r>
-        <w:rPr>
-          <w:rFonts w:ascii="Century Gothic" w:hAnsi="Century Gothic"/>
-          <w:sz w:val="15"/>
-          <w:szCs w:val="15"/>
-        </w:rPr>
-        <w:t>CrewAI</w:t>
-      </w:r>
-      <w:proofErr w:type="spellEnd"/>
-      <w:r>
-        <w:rPr>
-          <w:rFonts w:ascii="Century Gothic" w:hAnsi="Century Gothic"/>
-          <w:sz w:val="15"/>
-          <w:szCs w:val="15"/>
-        </w:rPr>
-        <w:t xml:space="preserve">, </w:t>
-      </w:r>
-      <w:proofErr w:type="spellStart"/>
-      <w:r>
-        <w:rPr>
-          <w:rFonts w:ascii="Century Gothic" w:hAnsi="Century Gothic"/>
-          <w:sz w:val="15"/>
-          <w:szCs w:val="15"/>
-        </w:rPr>
-        <w:t>PhiData</w:t>
-      </w:r>
-      <w:proofErr w:type="spellEnd"/>
-      <w:r>
-        <w:rPr>
-          <w:rFonts w:ascii="Century Gothic" w:hAnsi="Century Gothic"/>
-          <w:sz w:val="15"/>
-          <w:szCs w:val="15"/>
-        </w:rPr>
-        <w:t xml:space="preserve">, Semantic Kernel, </w:t>
-      </w:r>
-      <w:proofErr w:type="spellStart"/>
-      <w:r>
-        <w:rPr>
-          <w:rFonts w:ascii="Century Gothic" w:hAnsi="Century Gothic"/>
-          <w:sz w:val="15"/>
-          <w:szCs w:val="15"/>
-        </w:rPr>
-        <w:t>LangGraph</w:t>
-      </w:r>
-      <w:proofErr w:type="spellEnd"/>
-      <w:r>
-        <w:rPr>
-          <w:rFonts w:ascii="Century Gothic" w:hAnsi="Century Gothic"/>
-          <w:sz w:val="15"/>
-          <w:szCs w:val="15"/>
-        </w:rPr>
-        <w:t xml:space="preserve"> Agents, Tool Use, </w:t>
-      </w:r>
-      <w:proofErr w:type="spellStart"/>
-      <w:r>
-        <w:rPr>
-          <w:rFonts w:ascii="Century Gothic" w:hAnsi="Century Gothic"/>
-          <w:sz w:val="15"/>
-          <w:szCs w:val="15"/>
-        </w:rPr>
-        <w:t>ReAct</w:t>
-      </w:r>
-      <w:proofErr w:type="spellEnd"/>
-      <w:r>
-        <w:rPr>
-          <w:rFonts w:ascii="Century Gothic" w:hAnsi="Century Gothic"/>
-          <w:sz w:val="15"/>
-          <w:szCs w:val="15"/>
-        </w:rPr>
-        <w:t xml:space="preserve"> Framework, Prompt Chaining, Multi-Agent Orchestration, Retrieval Pipelines, Conversational AI</w:t>
-      </w:r>
-    </w:p>
-    <w:p>
-      <w:pPr>
-        <w:pStyle w:val="NormalWeb"/>
-        <w:spacing w:before="24" w:beforeAutospacing="0" w:after="24" w:afterAutospacing="0"/>
-        <w:jc w:val="both"/>
-        <w:rPr>
-          <w:rFonts w:ascii="Century Gothic" w:hAnsi="Century Gothic"/>
-          <w:sz w:val="15"/>
-          <w:szCs w:val="15"/>
-        </w:rPr>
-      </w:pPr>
-      <w:r>
-        <w:rPr>
-          <w:rStyle w:val="Strong"/>
-          <w:rFonts w:ascii="Century Gothic" w:eastAsiaTheme="majorEastAsia" w:hAnsi="Century Gothic"/>
-          <w:sz w:val="15"/>
-          <w:szCs w:val="15"/>
-        </w:rPr>
-        <w:t>Statistical &amp; Applied Mathematics:</w:t>
-      </w:r>
-      <w:r>
-        <w:rPr>
-          <w:rFonts w:ascii="Century Gothic" w:hAnsi="Century Gothic"/>
-          <w:sz w:val="15"/>
-          <w:szCs w:val="15"/>
-        </w:rPr>
-        <w:t xml:space="preserve"> Optimization Algorithms, Bayesian Methods, Time Series Forecasting, Statistical </w:t>
-      </w:r>
-      <w:proofErr w:type="spellStart"/>
-      <w:r>
-        <w:rPr>
-          <w:rFonts w:ascii="Century Gothic" w:hAnsi="Century Gothic"/>
-          <w:sz w:val="15"/>
-          <w:szCs w:val="15"/>
-        </w:rPr>
-        <w:t>Modeling</w:t>
-      </w:r>
-      <w:proofErr w:type="spellEnd"/>
-      <w:r>
-        <w:rPr>
-          <w:rFonts w:ascii="Century Gothic" w:hAnsi="Century Gothic"/>
-          <w:sz w:val="15"/>
-          <w:szCs w:val="15"/>
-        </w:rPr>
-        <w:t>, Regression, Classification, Clustering, Dimensionality Reduction, Linear Algebra, Probability Theory, Predictive Analytics, Simulation</w:t>
+        <w:t>Visualization &amp; BI:</w:t>
+      </w:r>
+      <w:r>
+        <w:rPr>
+          <w:rFonts w:ascii="Century Gothic" w:hAnsi="Century Gothic"/>
+          <w:sz w:val="15"/>
+          <w:szCs w:val="15"/>
+        </w:rPr>
+        <w:t xml:space="preserve"> Streamlit, Gradio, Power BI, Tableau</w:t>
       </w:r>
     </w:p>
     <w:p>
@@ -1670,163 +657,15 @@
           <w14:ligatures w14:val="none"/>
         </w:rPr>
         <w:t xml:space="preserve">Senior AI Engineer </w:t>
-      </w:r>
-      <w:r>
-        <w:rPr>
-          <w:rFonts w:ascii="Century Gothic" w:eastAsia="Times New Roman" w:hAnsi="Century Gothic" w:cs="Times New Roman"/>
-          <w:b/>
-          <w:bCs/>
-          <w:kern w:val="0"/>
-          <w:sz w:val="15"/>
-          <w:szCs w:val="15"/>
-          <w:lang w:eastAsia="en-GB"/>
-          <w14:ligatures w14:val="none"/>
-        </w:rPr>
         <w:tab/>
-      </w:r>
-      <w:r>
-        <w:rPr>
-          <w:rFonts w:ascii="Century Gothic" w:eastAsia="Times New Roman" w:hAnsi="Century Gothic" w:cs="Times New Roman"/>
-          <w:b/>
-          <w:bCs/>
-          <w:kern w:val="0"/>
-          <w:sz w:val="15"/>
-          <w:szCs w:val="15"/>
-          <w:lang w:eastAsia="en-GB"/>
-          <w14:ligatures w14:val="none"/>
-        </w:rPr>
         <w:tab/>
-      </w:r>
-      <w:r>
-        <w:rPr>
-          <w:rFonts w:ascii="Century Gothic" w:eastAsia="Times New Roman" w:hAnsi="Century Gothic" w:cs="Times New Roman"/>
-          <w:b/>
-          <w:bCs/>
-          <w:kern w:val="0"/>
-          <w:sz w:val="15"/>
-          <w:szCs w:val="15"/>
-          <w:lang w:eastAsia="en-GB"/>
-          <w14:ligatures w14:val="none"/>
-        </w:rPr>
         <w:tab/>
-      </w:r>
-      <w:r>
-        <w:rPr>
-          <w:rFonts w:ascii="Century Gothic" w:eastAsia="Times New Roman" w:hAnsi="Century Gothic" w:cs="Times New Roman"/>
-          <w:b/>
-          <w:bCs/>
-          <w:kern w:val="0"/>
-          <w:sz w:val="15"/>
-          <w:szCs w:val="15"/>
-          <w:lang w:eastAsia="en-GB"/>
-          <w14:ligatures w14:val="none"/>
-        </w:rPr>
         <w:tab/>
-      </w:r>
-      <w:r>
-        <w:rPr>
-          <w:rFonts w:ascii="Century Gothic" w:eastAsia="Times New Roman" w:hAnsi="Century Gothic" w:cs="Times New Roman"/>
-          <w:b/>
-          <w:bCs/>
-          <w:kern w:val="0"/>
-          <w:sz w:val="15"/>
-          <w:szCs w:val="15"/>
-          <w:lang w:eastAsia="en-GB"/>
-          <w14:ligatures w14:val="none"/>
-        </w:rPr>
         <w:tab/>
-      </w:r>
-      <w:r>
-        <w:rPr>
-          <w:rFonts w:ascii="Century Gothic" w:eastAsia="Times New Roman" w:hAnsi="Century Gothic" w:cs="Times New Roman"/>
-          <w:b/>
-          <w:bCs/>
-          <w:kern w:val="0"/>
-          <w:sz w:val="15"/>
-          <w:szCs w:val="15"/>
-          <w:lang w:eastAsia="en-GB"/>
-          <w14:ligatures w14:val="none"/>
-        </w:rPr>
         <w:tab/>
-      </w:r>
-      <w:r>
-        <w:rPr>
-          <w:rFonts w:ascii="Century Gothic" w:eastAsia="Times New Roman" w:hAnsi="Century Gothic" w:cs="Times New Roman"/>
-          <w:b/>
-          <w:bCs/>
-          <w:kern w:val="0"/>
-          <w:sz w:val="15"/>
-          <w:szCs w:val="15"/>
-          <w:lang w:eastAsia="en-GB"/>
-          <w14:ligatures w14:val="none"/>
-        </w:rPr>
         <w:tab/>
-      </w:r>
-      <w:r>
-        <w:rPr>
-          <w:rFonts w:ascii="Century Gothic" w:eastAsia="Times New Roman" w:hAnsi="Century Gothic" w:cs="Times New Roman"/>
-          <w:b/>
-          <w:bCs/>
-          <w:kern w:val="0"/>
-          <w:sz w:val="15"/>
-          <w:szCs w:val="15"/>
-          <w:lang w:eastAsia="en-GB"/>
-          <w14:ligatures w14:val="none"/>
-        </w:rPr>
         <w:tab/>
-        <w:t xml:space="preserve">         </w:t>
-      </w:r>
-      <w:r>
-        <w:rPr>
-          <w:rFonts w:ascii="Century Gothic" w:eastAsia="Times New Roman" w:hAnsi="Century Gothic" w:cs="Times New Roman"/>
-          <w:b/>
-          <w:bCs/>
-          <w:kern w:val="0"/>
-          <w:sz w:val="15"/>
-          <w:szCs w:val="15"/>
-          <w:lang w:eastAsia="en-GB"/>
-          <w14:ligatures w14:val="none"/>
-        </w:rPr>
-        <w:t xml:space="preserve">              </w:t>
-      </w:r>
-      <w:r>
-        <w:rPr>
-          <w:rFonts w:ascii="Century Gothic" w:eastAsia="Times New Roman" w:hAnsi="Century Gothic" w:cs="Times New Roman"/>
-          <w:b/>
-          <w:bCs/>
-          <w:kern w:val="0"/>
-          <w:sz w:val="15"/>
-          <w:szCs w:val="15"/>
-          <w:lang w:eastAsia="en-GB"/>
-          <w14:ligatures w14:val="none"/>
-        </w:rPr>
-        <w:t xml:space="preserve">     Nov 202</w:t>
-      </w:r>
-      <w:r>
-        <w:rPr>
-          <w:rFonts w:ascii="Century Gothic" w:eastAsia="Times New Roman" w:hAnsi="Century Gothic" w:cs="Times New Roman"/>
-          <w:b/>
-          <w:bCs/>
-          <w:kern w:val="0"/>
-          <w:sz w:val="15"/>
-          <w:szCs w:val="15"/>
-          <w:lang w:eastAsia="en-GB"/>
-          <w14:ligatures w14:val="none"/>
-        </w:rPr>
-        <w:t>5</w:t>
-      </w:r>
-      <w:r>
-        <w:rPr>
-          <w:rFonts w:ascii="Century Gothic" w:eastAsia="Times New Roman" w:hAnsi="Century Gothic" w:cs="Times New Roman"/>
-          <w:b/>
-          <w:bCs/>
-          <w:kern w:val="0"/>
-          <w:sz w:val="15"/>
-          <w:szCs w:val="15"/>
-          <w:lang w:eastAsia="en-GB"/>
-          <w14:ligatures w14:val="none"/>
-        </w:rPr>
-        <w:t xml:space="preserve"> - Present</w:t>
+        <w:t xml:space="preserve">                            Nov 2025 - Present</w:t>
       </w:r>
     </w:p>
     <w:p>
@@ -1879,43 +718,7 @@
           <w:sz w:val="15"/>
           <w:szCs w:val="15"/>
         </w:rPr>
-        <w:t xml:space="preserve">Architected and deployed multi-agent AI systems using LangChain, </w:t>
-      </w:r>
-      <w:proofErr w:type="spellStart"/>
-      <w:r>
-        <w:rPr>
-          <w:rFonts w:ascii="Century Gothic" w:hAnsi="Century Gothic"/>
-          <w:sz w:val="15"/>
-          <w:szCs w:val="15"/>
-        </w:rPr>
-        <w:t>LangGraph</w:t>
-      </w:r>
-      <w:proofErr w:type="spellEnd"/>
-      <w:r>
-        <w:rPr>
-          <w:rFonts w:ascii="Century Gothic" w:hAnsi="Century Gothic"/>
-          <w:sz w:val="15"/>
-          <w:szCs w:val="15"/>
-        </w:rPr>
-        <w:t xml:space="preserve">, and </w:t>
-      </w:r>
-      <w:proofErr w:type="spellStart"/>
-      <w:r>
-        <w:rPr>
-          <w:rFonts w:ascii="Century Gothic" w:hAnsi="Century Gothic"/>
-          <w:sz w:val="15"/>
-          <w:szCs w:val="15"/>
-        </w:rPr>
-        <w:t>AutoGen</w:t>
-      </w:r>
-      <w:proofErr w:type="spellEnd"/>
-      <w:r>
-        <w:rPr>
-          <w:rFonts w:ascii="Century Gothic" w:hAnsi="Century Gothic"/>
-          <w:sz w:val="15"/>
-          <w:szCs w:val="15"/>
-        </w:rPr>
-        <w:t xml:space="preserve"> to automate energy grid optimization workflows, reducing manual intervention by 55% and improving operational decision latency by 40% across renewable energy planning pipelines.</w:t>
+        <w:t xml:space="preserve">Architected and deployed multi-agent AI systems using LangChain, LangGraph, and AutoGen, integrating Model Context Protocol (MCP) servers for standardized tool and data access, to automate energy grid optimization workflows, reducing manual intervention by 55% and improving operational decision latency by 40% across renewable energy planning pipelines.</w:t>
       </w:r>
     </w:p>
     <w:p>
@@ -1939,61 +742,7 @@
           <w:sz w:val="15"/>
           <w:szCs w:val="15"/>
         </w:rPr>
-        <w:t>Fine-tuned domain-specific LLMs (</w:t>
-      </w:r>
-      <w:proofErr w:type="spellStart"/>
-      <w:r>
-        <w:rPr>
-          <w:rFonts w:ascii="Century Gothic" w:hAnsi="Century Gothic"/>
-          <w:sz w:val="15"/>
-          <w:szCs w:val="15"/>
-        </w:rPr>
-        <w:t>LLaMA</w:t>
-      </w:r>
-      <w:proofErr w:type="spellEnd"/>
-      <w:r>
-        <w:rPr>
-          <w:rFonts w:ascii="Century Gothic" w:hAnsi="Century Gothic"/>
-          <w:sz w:val="15"/>
-          <w:szCs w:val="15"/>
-        </w:rPr>
-        <w:t xml:space="preserve"> 3, Mistral) using </w:t>
-      </w:r>
-      <w:proofErr w:type="spellStart"/>
-      <w:r>
-        <w:rPr>
-          <w:rFonts w:ascii="Century Gothic" w:hAnsi="Century Gothic"/>
-          <w:sz w:val="15"/>
-          <w:szCs w:val="15"/>
-        </w:rPr>
-        <w:t>LoRA</w:t>
-      </w:r>
-      <w:proofErr w:type="spellEnd"/>
-      <w:r>
-        <w:rPr>
-          <w:rFonts w:ascii="Century Gothic" w:hAnsi="Century Gothic"/>
-          <w:sz w:val="15"/>
-          <w:szCs w:val="15"/>
-        </w:rPr>
-        <w:t xml:space="preserve"> and </w:t>
-      </w:r>
-      <w:proofErr w:type="spellStart"/>
-      <w:r>
-        <w:rPr>
-          <w:rFonts w:ascii="Century Gothic" w:hAnsi="Century Gothic"/>
-          <w:sz w:val="15"/>
-          <w:szCs w:val="15"/>
-        </w:rPr>
-        <w:t>QLoRA</w:t>
-      </w:r>
-      <w:proofErr w:type="spellEnd"/>
-      <w:r>
-        <w:rPr>
-          <w:rFonts w:ascii="Century Gothic" w:hAnsi="Century Gothic"/>
-          <w:sz w:val="15"/>
-          <w:szCs w:val="15"/>
-        </w:rPr>
-        <w:t xml:space="preserve"> on energy forecasting and asset maintenance datasets, achieving 92% prediction accuracy on wind and solar output models and reducing unplanned outages by 30%.</w:t>
+        <w:t xml:space="preserve">Fine-tuned domain-specific LLMs (LLaMA 3, Mistral) using LoRA and QLoRA and served them via vLLM for high-throughput inference on energy forecasting and asset maintenance datasets, achieving 92% prediction accuracy on wind and solar output models and reducing unplanned outages by 30%.</w:t>
       </w:r>
     </w:p>
     <w:p>
@@ -2017,25 +766,7 @@
           <w:sz w:val="15"/>
           <w:szCs w:val="15"/>
         </w:rPr>
-        <w:t xml:space="preserve">Built end-to-end RAG pipelines using </w:t>
-      </w:r>
-      <w:proofErr w:type="spellStart"/>
-      <w:r>
-        <w:rPr>
-          <w:rFonts w:ascii="Century Gothic" w:hAnsi="Century Gothic"/>
-          <w:sz w:val="15"/>
-          <w:szCs w:val="15"/>
-        </w:rPr>
-        <w:t>LlamaIndex</w:t>
-      </w:r>
-      <w:proofErr w:type="spellEnd"/>
-      <w:r>
-        <w:rPr>
-          <w:rFonts w:ascii="Century Gothic" w:hAnsi="Century Gothic"/>
-          <w:sz w:val="15"/>
-          <w:szCs w:val="15"/>
-        </w:rPr>
-        <w:t>, Pinecone, and AWS Bedrock to enable intelligent document retrieval across 10M+ regulatory compliance and grid operations records, improving analyst query resolution speed by 65% and reducing hallucination rates through advanced semantic chunking strategies.</w:t>
+        <w:t xml:space="preserve">Built end-to-end RAG pipelines using LlamaIndex, Pinecone, and AWS Bedrock to enable intelligent document retrieval across 10M+ regulatory compliance and grid operations records, improving analyst query resolution speed by 65% and reducing hallucination rates through advanced semantic chunking strategies.</w:t>
       </w:r>
     </w:p>
     <w:p>
@@ -2059,25 +790,7 @@
           <w:sz w:val="15"/>
           <w:szCs w:val="15"/>
         </w:rPr>
-        <w:t xml:space="preserve">Designed multimodal AI pipelines combining CLIP and GPT-4o Vision to </w:t>
-      </w:r>
-      <w:proofErr w:type="spellStart"/>
-      <w:r>
-        <w:rPr>
-          <w:rFonts w:ascii="Century Gothic" w:hAnsi="Century Gothic"/>
-          <w:sz w:val="15"/>
-          <w:szCs w:val="15"/>
-        </w:rPr>
-        <w:t>analyze</w:t>
-      </w:r>
-      <w:proofErr w:type="spellEnd"/>
-      <w:r>
-        <w:rPr>
-          <w:rFonts w:ascii="Century Gothic" w:hAnsi="Century Gothic"/>
-          <w:sz w:val="15"/>
-          <w:szCs w:val="15"/>
-        </w:rPr>
-        <w:t xml:space="preserve"> satellite imagery, sensor telemetry, and equipment inspection reports, enabling predictive maintenance decisions with 87% fault detection precision across 500+ wind turbines.</w:t>
+        <w:t xml:space="preserve">Designed multimodal AI pipelines combining CLIP and GPT-4o Vision to analyze satellite imagery, sensor telemetry, and equipment inspection reports, enabling predictive maintenance decisions with 87% fault detection precision across 500+ wind turbines.</w:t>
       </w:r>
     </w:p>
     <w:p>
@@ -2101,43 +814,7 @@
           <w:sz w:val="15"/>
           <w:szCs w:val="15"/>
         </w:rPr>
-        <w:t xml:space="preserve">Implemented </w:t>
-      </w:r>
-      <w:proofErr w:type="spellStart"/>
-      <w:r>
-        <w:rPr>
-          <w:rFonts w:ascii="Century Gothic" w:hAnsi="Century Gothic"/>
-          <w:sz w:val="15"/>
-          <w:szCs w:val="15"/>
-        </w:rPr>
-        <w:t>MLOps</w:t>
-      </w:r>
-      <w:proofErr w:type="spellEnd"/>
-      <w:r>
-        <w:rPr>
-          <w:rFonts w:ascii="Century Gothic" w:hAnsi="Century Gothic"/>
-          <w:sz w:val="15"/>
-          <w:szCs w:val="15"/>
-        </w:rPr>
-        <w:t xml:space="preserve"> governance frameworks using MLflow, Weights &amp; Biases, and Triton Inference Server on AWS SageMaker, establishing model versioning, automated drift detection, A/B testing pipelines, and </w:t>
-      </w:r>
-      <w:proofErr w:type="spellStart"/>
-      <w:r>
-        <w:rPr>
-          <w:rFonts w:ascii="Century Gothic" w:hAnsi="Century Gothic"/>
-          <w:sz w:val="15"/>
-          <w:szCs w:val="15"/>
-        </w:rPr>
-        <w:t>LLMOps</w:t>
-      </w:r>
-      <w:proofErr w:type="spellEnd"/>
-      <w:r>
-        <w:rPr>
-          <w:rFonts w:ascii="Century Gothic" w:hAnsi="Century Gothic"/>
-          <w:sz w:val="15"/>
-          <w:szCs w:val="15"/>
-        </w:rPr>
-        <w:t xml:space="preserve"> observability, cutting model rollback time by 70% and maintaining 99.95% uptime for production AI services.</w:t>
+        <w:t xml:space="preserve">Implemented MLOps governance frameworks using MLflow, Weights &amp; Biases, and Triton Inference Server on AWS SageMaker, establishing model versioning, automated drift detection, A/B testing pipelines, and LLMOps observability, cutting model rollback time by 70% and maintaining 99.95% uptime for production AI services.</w:t>
       </w:r>
     </w:p>
     <w:p>
@@ -2161,25 +838,7 @@
           <w:sz w:val="15"/>
           <w:szCs w:val="15"/>
         </w:rPr>
-        <w:t xml:space="preserve">Engineered real-time timeseries anomaly detection systems using </w:t>
-      </w:r>
-      <w:proofErr w:type="spellStart"/>
-      <w:r>
-        <w:rPr>
-          <w:rFonts w:ascii="Century Gothic" w:hAnsi="Century Gothic"/>
-          <w:sz w:val="15"/>
-          <w:szCs w:val="15"/>
-        </w:rPr>
-        <w:t>PyTorch</w:t>
-      </w:r>
-      <w:proofErr w:type="spellEnd"/>
-      <w:r>
-        <w:rPr>
-          <w:rFonts w:ascii="Century Gothic" w:hAnsi="Century Gothic"/>
-          <w:sz w:val="15"/>
-          <w:szCs w:val="15"/>
-        </w:rPr>
-        <w:t>, Apache Kafka, and Apache Spark on distributed computing clusters, processing 50TB+ of SCADA and sensor data daily to identify grid instability events 45% faster than legacy rule-based systems.</w:t>
+        <w:t xml:space="preserve">Engineered real-time timeseries anomaly detection systems using PyTorch, Apache Kafka, and Apache Spark on distributed computing clusters, processing 50TB+ of SCADA and sensor data daily to identify grid instability events 45% faster than legacy rule-based systems.</w:t>
       </w:r>
     </w:p>
     <w:p>
@@ -2204,25 +863,7 @@
           <w:szCs w:val="15"/>
         </w:rPr>
         <w:lastRenderedPageBreak/>
-        <w:t xml:space="preserve">Applied SHAP, LIME, and </w:t>
-      </w:r>
-      <w:proofErr w:type="spellStart"/>
-      <w:r>
-        <w:rPr>
-          <w:rFonts w:ascii="Century Gothic" w:hAnsi="Century Gothic"/>
-          <w:sz w:val="15"/>
-          <w:szCs w:val="15"/>
-        </w:rPr>
-        <w:t>Fairlearn</w:t>
-      </w:r>
-      <w:proofErr w:type="spellEnd"/>
-      <w:r>
-        <w:rPr>
-          <w:rFonts w:ascii="Century Gothic" w:hAnsi="Century Gothic"/>
-          <w:sz w:val="15"/>
-          <w:szCs w:val="15"/>
-        </w:rPr>
-        <w:t xml:space="preserve"> to deliver explainable AI dashboards for energy regulators, ensuring responsible AI standards compliance and bias-free optimization recommendations across demand forecasting models covering 5M+ utility customers.</w:t>
+        <w:t xml:space="preserve">Applied SHAP, LIME, and Fairlearn to deliver explainable AI dashboards for energy regulators, ensuring responsible AI standards compliance and bias-free optimization recommendations across demand forecasting models covering 5M+ utility customers.</w:t>
       </w:r>
     </w:p>
     <w:p>
@@ -2246,43 +887,7 @@
           <w:sz w:val="15"/>
           <w:szCs w:val="15"/>
         </w:rPr>
-        <w:t xml:space="preserve">Containerized and deployed AI inference services using Docker, Kubernetes (EKS), ONNX, and </w:t>
-      </w:r>
-      <w:proofErr w:type="spellStart"/>
-      <w:r>
-        <w:rPr>
-          <w:rFonts w:ascii="Century Gothic" w:hAnsi="Century Gothic"/>
-          <w:sz w:val="15"/>
-          <w:szCs w:val="15"/>
-        </w:rPr>
-        <w:t>TensorRT</w:t>
-      </w:r>
-      <w:proofErr w:type="spellEnd"/>
-      <w:r>
-        <w:rPr>
-          <w:rFonts w:ascii="Century Gothic" w:hAnsi="Century Gothic"/>
-          <w:sz w:val="15"/>
-          <w:szCs w:val="15"/>
-        </w:rPr>
-        <w:t xml:space="preserve"> with </w:t>
-      </w:r>
-      <w:proofErr w:type="spellStart"/>
-      <w:r>
-        <w:rPr>
-          <w:rFonts w:ascii="Century Gothic" w:hAnsi="Century Gothic"/>
-          <w:sz w:val="15"/>
-          <w:szCs w:val="15"/>
-        </w:rPr>
-        <w:t>FastAPI</w:t>
-      </w:r>
-      <w:proofErr w:type="spellEnd"/>
-      <w:r>
-        <w:rPr>
-          <w:rFonts w:ascii="Century Gothic" w:hAnsi="Century Gothic"/>
-          <w:sz w:val="15"/>
-          <w:szCs w:val="15"/>
-        </w:rPr>
-        <w:t xml:space="preserve"> microservices, reducing model inference latency by 48% and cloud compute costs by 32% through GPU optimization, model quantization, and knowledge distillation techniques.</w:t>
+        <w:t xml:space="preserve">Containerized and deployed AI inference services using Docker, Kubernetes (EKS), ONNX, and TensorRT behind FastAPI-based REST microservices, reducing model inference latency by 48% and cloud compute costs by 32% through GPU optimization, model quantization, and knowledge distillation techniques.</w:t>
       </w:r>
     </w:p>
     <w:p>
@@ -2325,150 +930,15 @@
           <w14:ligatures w14:val="none"/>
         </w:rPr>
         <w:t xml:space="preserve">Generative AI Engineer </w:t>
-      </w:r>
-      <w:r>
-        <w:rPr>
-          <w:rFonts w:ascii="Century Gothic" w:eastAsia="Times New Roman" w:hAnsi="Century Gothic" w:cs="Times New Roman"/>
-          <w:b/>
-          <w:bCs/>
-          <w:kern w:val="0"/>
-          <w:sz w:val="15"/>
-          <w:szCs w:val="15"/>
-          <w:lang w:eastAsia="en-GB"/>
-          <w14:ligatures w14:val="none"/>
-        </w:rPr>
         <w:tab/>
-      </w:r>
-      <w:r>
-        <w:rPr>
-          <w:rFonts w:ascii="Century Gothic" w:eastAsia="Times New Roman" w:hAnsi="Century Gothic" w:cs="Times New Roman"/>
-          <w:b/>
-          <w:bCs/>
-          <w:kern w:val="0"/>
-          <w:sz w:val="15"/>
-          <w:szCs w:val="15"/>
-          <w:lang w:eastAsia="en-GB"/>
-          <w14:ligatures w14:val="none"/>
-        </w:rPr>
         <w:tab/>
-      </w:r>
-      <w:r>
-        <w:rPr>
-          <w:rFonts w:ascii="Century Gothic" w:eastAsia="Times New Roman" w:hAnsi="Century Gothic" w:cs="Times New Roman"/>
-          <w:b/>
-          <w:bCs/>
-          <w:kern w:val="0"/>
-          <w:sz w:val="15"/>
-          <w:szCs w:val="15"/>
-          <w:lang w:eastAsia="en-GB"/>
-          <w14:ligatures w14:val="none"/>
-        </w:rPr>
         <w:tab/>
-      </w:r>
-      <w:r>
-        <w:rPr>
-          <w:rFonts w:ascii="Century Gothic" w:eastAsia="Times New Roman" w:hAnsi="Century Gothic" w:cs="Times New Roman"/>
-          <w:b/>
-          <w:bCs/>
-          <w:kern w:val="0"/>
-          <w:sz w:val="15"/>
-          <w:szCs w:val="15"/>
-          <w:lang w:eastAsia="en-GB"/>
-          <w14:ligatures w14:val="none"/>
-        </w:rPr>
         <w:tab/>
-      </w:r>
-      <w:r>
-        <w:rPr>
-          <w:rFonts w:ascii="Century Gothic" w:eastAsia="Times New Roman" w:hAnsi="Century Gothic" w:cs="Times New Roman"/>
-          <w:b/>
-          <w:bCs/>
-          <w:kern w:val="0"/>
-          <w:sz w:val="15"/>
-          <w:szCs w:val="15"/>
-          <w:lang w:eastAsia="en-GB"/>
-          <w14:ligatures w14:val="none"/>
-        </w:rPr>
         <w:tab/>
-      </w:r>
-      <w:r>
-        <w:rPr>
-          <w:rFonts w:ascii="Century Gothic" w:eastAsia="Times New Roman" w:hAnsi="Century Gothic" w:cs="Times New Roman"/>
-          <w:b/>
-          <w:bCs/>
-          <w:kern w:val="0"/>
-          <w:sz w:val="15"/>
-          <w:szCs w:val="15"/>
-          <w:lang w:eastAsia="en-GB"/>
-          <w14:ligatures w14:val="none"/>
-        </w:rPr>
         <w:tab/>
-      </w:r>
-      <w:r>
-        <w:rPr>
-          <w:rFonts w:ascii="Century Gothic" w:eastAsia="Times New Roman" w:hAnsi="Century Gothic" w:cs="Times New Roman"/>
-          <w:b/>
-          <w:bCs/>
-          <w:kern w:val="0"/>
-          <w:sz w:val="15"/>
-          <w:szCs w:val="15"/>
-          <w:lang w:eastAsia="en-GB"/>
-          <w14:ligatures w14:val="none"/>
-        </w:rPr>
         <w:tab/>
-      </w:r>
-      <w:r>
-        <w:rPr>
-          <w:rFonts w:ascii="Century Gothic" w:eastAsia="Times New Roman" w:hAnsi="Century Gothic" w:cs="Times New Roman"/>
-          <w:b/>
-          <w:bCs/>
-          <w:kern w:val="0"/>
-          <w:sz w:val="15"/>
-          <w:szCs w:val="15"/>
-          <w:lang w:eastAsia="en-GB"/>
-          <w14:ligatures w14:val="none"/>
-        </w:rPr>
         <w:tab/>
-        <w:t xml:space="preserve">        Oct 2024 </w:t>
-      </w:r>
-      <w:r>
-        <w:rPr>
-          <w:rFonts w:ascii="Century Gothic" w:eastAsia="Times New Roman" w:hAnsi="Century Gothic" w:cs="Times New Roman"/>
-          <w:b/>
-          <w:bCs/>
-          <w:kern w:val="0"/>
-          <w:sz w:val="15"/>
-          <w:szCs w:val="15"/>
-          <w:lang w:eastAsia="en-GB"/>
-          <w14:ligatures w14:val="none"/>
-        </w:rPr>
-        <w:t>–</w:t>
-      </w:r>
-      <w:r>
-        <w:rPr>
-          <w:rFonts w:ascii="Century Gothic" w:eastAsia="Times New Roman" w:hAnsi="Century Gothic" w:cs="Times New Roman"/>
-          <w:b/>
-          <w:bCs/>
-          <w:kern w:val="0"/>
-          <w:sz w:val="15"/>
-          <w:szCs w:val="15"/>
-          <w:lang w:eastAsia="en-GB"/>
-          <w14:ligatures w14:val="none"/>
-        </w:rPr>
-        <w:t xml:space="preserve"> </w:t>
-      </w:r>
-      <w:r>
-        <w:rPr>
-          <w:rFonts w:ascii="Century Gothic" w:eastAsia="Times New Roman" w:hAnsi="Century Gothic" w:cs="Times New Roman"/>
-          <w:b/>
-          <w:bCs/>
-          <w:kern w:val="0"/>
-          <w:sz w:val="15"/>
-          <w:szCs w:val="15"/>
-          <w:lang w:eastAsia="en-GB"/>
-          <w14:ligatures w14:val="none"/>
-        </w:rPr>
-        <w:t>Oct 2025</w:t>
+        <w:t xml:space="preserve">        Oct 2024 – Oct 2025</w:t>
       </w:r>
     </w:p>
     <w:p>
@@ -2593,25 +1063,7 @@
           <w:sz w:val="15"/>
           <w:szCs w:val="15"/>
         </w:rPr>
-        <w:t xml:space="preserve">Transitioned legacy inference models to AWS SageMaker with ONNX and </w:t>
-      </w:r>
-      <w:proofErr w:type="spellStart"/>
-      <w:r>
-        <w:rPr>
-          <w:rFonts w:ascii="Century Gothic" w:hAnsi="Century Gothic"/>
-          <w:sz w:val="15"/>
-          <w:szCs w:val="15"/>
-        </w:rPr>
-        <w:t>TensorRT</w:t>
-      </w:r>
-      <w:proofErr w:type="spellEnd"/>
-      <w:r>
-        <w:rPr>
-          <w:rFonts w:ascii="Century Gothic" w:hAnsi="Century Gothic"/>
-          <w:sz w:val="15"/>
-          <w:szCs w:val="15"/>
-        </w:rPr>
-        <w:t xml:space="preserve"> containers, cutting prediction latency by 35% in client-facing decision systems.</w:t>
+        <w:t xml:space="preserve">Transitioned legacy inference models to AWS SageMaker with ONNX and TensorRT containers, cutting prediction latency by 35% in client-facing decision systems.</w:t>
       </w:r>
     </w:p>
     <w:p>
@@ -2848,25 +1300,7 @@
           <w:sz w:val="15"/>
           <w:szCs w:val="15"/>
         </w:rPr>
-        <w:t xml:space="preserve">Created deep learning models in </w:t>
-      </w:r>
-      <w:proofErr w:type="spellStart"/>
-      <w:r>
-        <w:rPr>
-          <w:rFonts w:ascii="Century Gothic" w:hAnsi="Century Gothic"/>
-          <w:sz w:val="15"/>
-          <w:szCs w:val="15"/>
-        </w:rPr>
-        <w:t>PyTorch</w:t>
-      </w:r>
-      <w:proofErr w:type="spellEnd"/>
-      <w:r>
-        <w:rPr>
-          <w:rFonts w:ascii="Century Gothic" w:hAnsi="Century Gothic"/>
-          <w:sz w:val="15"/>
-          <w:szCs w:val="15"/>
-        </w:rPr>
-        <w:t xml:space="preserve"> and TensorFlow for customer churn prediction and underwriting score calibration, improving decision precision by 18%.</w:t>
+        <w:t xml:space="preserve">Created deep learning models in PyTorch and TensorFlow for customer churn prediction and underwriting score calibration, improving decision precision by 18%.</w:t>
       </w:r>
     </w:p>
     <w:p>
@@ -2938,43 +1372,7 @@
           <w:sz w:val="15"/>
           <w:szCs w:val="15"/>
         </w:rPr>
-        <w:t xml:space="preserve">Served ML models through REST and </w:t>
-      </w:r>
-      <w:proofErr w:type="spellStart"/>
-      <w:r>
-        <w:rPr>
-          <w:rFonts w:ascii="Century Gothic" w:hAnsi="Century Gothic"/>
-          <w:sz w:val="15"/>
-          <w:szCs w:val="15"/>
-        </w:rPr>
-        <w:t>GraphQL</w:t>
-      </w:r>
-      <w:proofErr w:type="spellEnd"/>
-      <w:r>
-        <w:rPr>
-          <w:rFonts w:ascii="Century Gothic" w:hAnsi="Century Gothic"/>
-          <w:sz w:val="15"/>
-          <w:szCs w:val="15"/>
-        </w:rPr>
-        <w:t xml:space="preserve"> APIs using </w:t>
-      </w:r>
-      <w:proofErr w:type="spellStart"/>
-      <w:r>
-        <w:rPr>
-          <w:rFonts w:ascii="Century Gothic" w:hAnsi="Century Gothic"/>
-          <w:sz w:val="15"/>
-          <w:szCs w:val="15"/>
-        </w:rPr>
-        <w:t>FastAPI</w:t>
-      </w:r>
-      <w:proofErr w:type="spellEnd"/>
-      <w:r>
-        <w:rPr>
-          <w:rFonts w:ascii="Century Gothic" w:hAnsi="Century Gothic"/>
-          <w:sz w:val="15"/>
-          <w:szCs w:val="15"/>
-        </w:rPr>
-        <w:t>, enhancing system interactivity with internal underwriting and claim management platforms.</w:t>
+        <w:t xml:space="preserve">Built and served full-stack REST and GraphQL API layers with FastAPI to expose ML model predictions, enhancing system interactivity with internal underwriting and claim management platforms.</w:t>
       </w:r>
     </w:p>
     <w:p>
@@ -3066,96 +1464,12 @@
           <w14:ligatures w14:val="none"/>
         </w:rPr>
         <w:t xml:space="preserve">Data Scientist                                  </w:t>
-      </w:r>
-      <w:r>
-        <w:rPr>
-          <w:rFonts w:ascii="Century Gothic" w:eastAsia="Times New Roman" w:hAnsi="Century Gothic" w:cs="Times New Roman"/>
-          <w:b/>
-          <w:bCs/>
-          <w:kern w:val="0"/>
-          <w:sz w:val="15"/>
-          <w:szCs w:val="15"/>
-          <w:lang w:eastAsia="en-GB"/>
-          <w14:ligatures w14:val="none"/>
-        </w:rPr>
         <w:tab/>
-      </w:r>
-      <w:r>
-        <w:rPr>
-          <w:rFonts w:ascii="Century Gothic" w:eastAsia="Times New Roman" w:hAnsi="Century Gothic" w:cs="Times New Roman"/>
-          <w:b/>
-          <w:bCs/>
-          <w:kern w:val="0"/>
-          <w:sz w:val="15"/>
-          <w:szCs w:val="15"/>
-          <w:lang w:eastAsia="en-GB"/>
-          <w14:ligatures w14:val="none"/>
-        </w:rPr>
         <w:tab/>
-      </w:r>
-      <w:r>
-        <w:rPr>
-          <w:rFonts w:ascii="Century Gothic" w:eastAsia="Times New Roman" w:hAnsi="Century Gothic" w:cs="Times New Roman"/>
-          <w:b/>
-          <w:bCs/>
-          <w:kern w:val="0"/>
-          <w:sz w:val="15"/>
-          <w:szCs w:val="15"/>
-          <w:lang w:eastAsia="en-GB"/>
-          <w14:ligatures w14:val="none"/>
-        </w:rPr>
         <w:tab/>
-      </w:r>
-      <w:r>
-        <w:rPr>
-          <w:rFonts w:ascii="Century Gothic" w:eastAsia="Times New Roman" w:hAnsi="Century Gothic" w:cs="Times New Roman"/>
-          <w:b/>
-          <w:bCs/>
-          <w:kern w:val="0"/>
-          <w:sz w:val="15"/>
-          <w:szCs w:val="15"/>
-          <w:lang w:eastAsia="en-GB"/>
-          <w14:ligatures w14:val="none"/>
-        </w:rPr>
         <w:tab/>
-      </w:r>
-      <w:r>
-        <w:rPr>
-          <w:rFonts w:ascii="Century Gothic" w:eastAsia="Times New Roman" w:hAnsi="Century Gothic" w:cs="Times New Roman"/>
-          <w:b/>
-          <w:bCs/>
-          <w:kern w:val="0"/>
-          <w:sz w:val="15"/>
-          <w:szCs w:val="15"/>
-          <w:lang w:eastAsia="en-GB"/>
-          <w14:ligatures w14:val="none"/>
-        </w:rPr>
         <w:tab/>
-      </w:r>
-      <w:r>
-        <w:rPr>
-          <w:rFonts w:ascii="Century Gothic" w:eastAsia="Times New Roman" w:hAnsi="Century Gothic" w:cs="Times New Roman"/>
-          <w:b/>
-          <w:bCs/>
-          <w:kern w:val="0"/>
-          <w:sz w:val="15"/>
-          <w:szCs w:val="15"/>
-          <w:lang w:eastAsia="en-GB"/>
-          <w14:ligatures w14:val="none"/>
-        </w:rPr>
         <w:tab/>
-      </w:r>
-      <w:r>
-        <w:rPr>
-          <w:rFonts w:ascii="Century Gothic" w:eastAsia="Times New Roman" w:hAnsi="Century Gothic" w:cs="Times New Roman"/>
-          <w:b/>
-          <w:bCs/>
-          <w:kern w:val="0"/>
-          <w:sz w:val="15"/>
-          <w:szCs w:val="15"/>
-          <w:lang w:eastAsia="en-GB"/>
-          <w14:ligatures w14:val="none"/>
-        </w:rPr>
         <w:tab/>
         <w:t xml:space="preserve">       Feb 2021 - June 2023</w:t>
       </w:r>
@@ -3210,61 +1524,7 @@
           <w:sz w:val="15"/>
           <w:szCs w:val="15"/>
         </w:rPr>
-        <w:t xml:space="preserve">Built customer segmentation models using </w:t>
-      </w:r>
-      <w:proofErr w:type="spellStart"/>
-      <w:r>
-        <w:rPr>
-          <w:rFonts w:ascii="Century Gothic" w:hAnsi="Century Gothic"/>
-          <w:sz w:val="15"/>
-          <w:szCs w:val="15"/>
-        </w:rPr>
-        <w:t>Keras</w:t>
-      </w:r>
-      <w:proofErr w:type="spellEnd"/>
-      <w:r>
-        <w:rPr>
-          <w:rFonts w:ascii="Century Gothic" w:hAnsi="Century Gothic"/>
-          <w:sz w:val="15"/>
-          <w:szCs w:val="15"/>
-        </w:rPr>
-        <w:t xml:space="preserve"> and Hugging Face Transformers to </w:t>
-      </w:r>
-      <w:proofErr w:type="spellStart"/>
-      <w:r>
-        <w:rPr>
-          <w:rFonts w:ascii="Century Gothic" w:hAnsi="Century Gothic"/>
-          <w:sz w:val="15"/>
-          <w:szCs w:val="15"/>
-        </w:rPr>
-        <w:t>analyze</w:t>
-      </w:r>
-      <w:proofErr w:type="spellEnd"/>
-      <w:r>
-        <w:rPr>
-          <w:rFonts w:ascii="Century Gothic" w:hAnsi="Century Gothic"/>
-          <w:sz w:val="15"/>
-          <w:szCs w:val="15"/>
-        </w:rPr>
-        <w:t xml:space="preserve"> </w:t>
-      </w:r>
-      <w:proofErr w:type="spellStart"/>
-      <w:r>
-        <w:rPr>
-          <w:rFonts w:ascii="Century Gothic" w:hAnsi="Century Gothic"/>
-          <w:sz w:val="15"/>
-          <w:szCs w:val="15"/>
-        </w:rPr>
-        <w:t>behavioral</w:t>
-      </w:r>
-      <w:proofErr w:type="spellEnd"/>
-      <w:r>
-        <w:rPr>
-          <w:rFonts w:ascii="Century Gothic" w:hAnsi="Century Gothic"/>
-          <w:sz w:val="15"/>
-          <w:szCs w:val="15"/>
-        </w:rPr>
-        <w:t xml:space="preserve"> data, enabling marketing campaigns to deliver 20% more personalized recommendations across digital channels.</w:t>
+        <w:t xml:space="preserve">Built customer segmentation models using Keras and Hugging Face Transformers to analyze behavioral data, enabling marketing campaigns to deliver 20% more personalized recommendations across digital channels.</w:t>
       </w:r>
     </w:p>
     <w:p>
@@ -3289,25 +1549,7 @@
           <w:sz w:val="15"/>
           <w:szCs w:val="15"/>
         </w:rPr>
-        <w:t xml:space="preserve">Developed real-time fraud detection pipelines using Apache Kafka and Flink to </w:t>
-      </w:r>
-      <w:proofErr w:type="spellStart"/>
-      <w:r>
-        <w:rPr>
-          <w:rFonts w:ascii="Century Gothic" w:hAnsi="Century Gothic"/>
-          <w:sz w:val="15"/>
-          <w:szCs w:val="15"/>
-        </w:rPr>
-        <w:t>analyze</w:t>
-      </w:r>
-      <w:proofErr w:type="spellEnd"/>
-      <w:r>
-        <w:rPr>
-          <w:rFonts w:ascii="Century Gothic" w:hAnsi="Century Gothic"/>
-          <w:sz w:val="15"/>
-          <w:szCs w:val="15"/>
-        </w:rPr>
-        <w:t xml:space="preserve"> streaming payment events, which cut false positive rates by 30% and improved transaction approval accuracy.</w:t>
+        <w:t xml:space="preserve">Developed real-time fraud detection pipelines using Apache Kafka and Flink to analyze streaming payment events, which cut false positive rates by 30% and improved transaction approval accuracy.</w:t>
       </w:r>
     </w:p>
     <w:p>
@@ -3419,31 +1661,7 @@
           <w:lang w:eastAsia="en-GB"/>
           <w14:ligatures w14:val="none"/>
         </w:rPr>
-        <w:t xml:space="preserve">Accelerated ETL pipelines with Apache </w:t>
-      </w:r>
-      <w:proofErr w:type="spellStart"/>
-      <w:r>
-        <w:rPr>
-          <w:rFonts w:ascii="Century Gothic" w:eastAsia="Times New Roman" w:hAnsi="Century Gothic" w:cs="Times New Roman"/>
-          <w:kern w:val="0"/>
-          <w:sz w:val="15"/>
-          <w:szCs w:val="15"/>
-          <w:lang w:eastAsia="en-GB"/>
-          <w14:ligatures w14:val="none"/>
-        </w:rPr>
-        <w:t>NiFi</w:t>
-      </w:r>
-      <w:proofErr w:type="spellEnd"/>
-      <w:r>
-        <w:rPr>
-          <w:rFonts w:ascii="Century Gothic" w:eastAsia="Times New Roman" w:hAnsi="Century Gothic" w:cs="Times New Roman"/>
-          <w:kern w:val="0"/>
-          <w:sz w:val="15"/>
-          <w:szCs w:val="15"/>
-          <w:lang w:eastAsia="en-GB"/>
-          <w14:ligatures w14:val="none"/>
-        </w:rPr>
-        <w:t xml:space="preserve"> and Spark, increasing throughput by 45%.</w:t>
+        <w:t xml:space="preserve">Accelerated ETL pipelines with Apache NiFi and Spark, increasing throughput by 45%.</w:t>
       </w:r>
     </w:p>
     <w:p>
@@ -3518,70 +1736,10 @@
           <w14:ligatures w14:val="none"/>
         </w:rPr>
         <w:t xml:space="preserve">Data Scientist                                                                             </w:t>
-      </w:r>
-      <w:r>
-        <w:rPr>
-          <w:rFonts w:ascii="Century Gothic" w:eastAsia="Times New Roman" w:hAnsi="Century Gothic" w:cs="Times New Roman"/>
-          <w:b/>
-          <w:bCs/>
-          <w:kern w:val="0"/>
-          <w:sz w:val="15"/>
-          <w:szCs w:val="15"/>
-          <w:lang w:eastAsia="en-GB"/>
-          <w14:ligatures w14:val="none"/>
-        </w:rPr>
         <w:tab/>
-      </w:r>
-      <w:r>
-        <w:rPr>
-          <w:rFonts w:ascii="Century Gothic" w:eastAsia="Times New Roman" w:hAnsi="Century Gothic" w:cs="Times New Roman"/>
-          <w:b/>
-          <w:bCs/>
-          <w:kern w:val="0"/>
-          <w:sz w:val="15"/>
-          <w:szCs w:val="15"/>
-          <w:lang w:eastAsia="en-GB"/>
-          <w14:ligatures w14:val="none"/>
-        </w:rPr>
         <w:tab/>
-      </w:r>
-      <w:r>
-        <w:rPr>
-          <w:rFonts w:ascii="Century Gothic" w:eastAsia="Times New Roman" w:hAnsi="Century Gothic" w:cs="Times New Roman"/>
-          <w:b/>
-          <w:bCs/>
-          <w:kern w:val="0"/>
-          <w:sz w:val="15"/>
-          <w:szCs w:val="15"/>
-          <w:lang w:eastAsia="en-GB"/>
-          <w14:ligatures w14:val="none"/>
-        </w:rPr>
         <w:tab/>
-      </w:r>
-      <w:r>
-        <w:rPr>
-          <w:rFonts w:ascii="Century Gothic" w:eastAsia="Times New Roman" w:hAnsi="Century Gothic" w:cs="Times New Roman"/>
-          <w:b/>
-          <w:bCs/>
-          <w:kern w:val="0"/>
-          <w:sz w:val="15"/>
-          <w:szCs w:val="15"/>
-          <w:lang w:eastAsia="en-GB"/>
-          <w14:ligatures w14:val="none"/>
-        </w:rPr>
         <w:tab/>
-      </w:r>
-      <w:r>
-        <w:rPr>
-          <w:rFonts w:ascii="Century Gothic" w:eastAsia="Times New Roman" w:hAnsi="Century Gothic" w:cs="Times New Roman"/>
-          <w:b/>
-          <w:bCs/>
-          <w:kern w:val="0"/>
-          <w:sz w:val="15"/>
-          <w:szCs w:val="15"/>
-          <w:lang w:eastAsia="en-GB"/>
-          <w14:ligatures w14:val="none"/>
-        </w:rPr>
         <w:tab/>
         <w:t xml:space="preserve">         Oct 2019 - Jan 2021</w:t>
       </w:r>
@@ -3734,25 +1892,7 @@
           <w:sz w:val="15"/>
           <w:szCs w:val="15"/>
         </w:rPr>
-        <w:t xml:space="preserve">Accelerated ML deployment cycles by integrating Jenkins with </w:t>
-      </w:r>
-      <w:proofErr w:type="spellStart"/>
-      <w:r>
-        <w:rPr>
-          <w:rFonts w:ascii="Century Gothic" w:hAnsi="Century Gothic"/>
-          <w:sz w:val="15"/>
-          <w:szCs w:val="15"/>
-        </w:rPr>
-        <w:t>Dockerized</w:t>
-      </w:r>
-      <w:proofErr w:type="spellEnd"/>
-      <w:r>
-        <w:rPr>
-          <w:rFonts w:ascii="Century Gothic" w:hAnsi="Century Gothic"/>
-          <w:sz w:val="15"/>
-          <w:szCs w:val="15"/>
-        </w:rPr>
-        <w:t xml:space="preserve"> services, reducing delays in pushing predictive models into production by 35%.</w:t>
+        <w:t xml:space="preserve">Accelerated ML deployment cycles by integrating Jenkins with Dockerized services, reducing delays in pushing predictive models into production by 35%.</w:t>
       </w:r>
     </w:p>
     <w:p>
@@ -4060,31 +2200,7 @@
           <w:lang w:eastAsia="en-GB"/>
           <w14:ligatures w14:val="none"/>
         </w:rPr>
-        <w:t xml:space="preserve">Built a text-to-image synthesis system using Stable Diffusion and </w:t>
-      </w:r>
-      <w:proofErr w:type="spellStart"/>
-      <w:r>
-        <w:rPr>
-          <w:rFonts w:ascii="Century Gothic" w:eastAsia="Times New Roman" w:hAnsi="Century Gothic" w:cs="Times New Roman"/>
-          <w:kern w:val="0"/>
-          <w:sz w:val="15"/>
-          <w:szCs w:val="15"/>
-          <w:lang w:eastAsia="en-GB"/>
-          <w14:ligatures w14:val="none"/>
-        </w:rPr>
-        <w:t>DreamBooth</w:t>
-      </w:r>
-      <w:proofErr w:type="spellEnd"/>
-      <w:r>
-        <w:rPr>
-          <w:rFonts w:ascii="Century Gothic" w:eastAsia="Times New Roman" w:hAnsi="Century Gothic" w:cs="Times New Roman"/>
-          <w:kern w:val="0"/>
-          <w:sz w:val="15"/>
-          <w:szCs w:val="15"/>
-          <w:lang w:eastAsia="en-GB"/>
-          <w14:ligatures w14:val="none"/>
-        </w:rPr>
-        <w:t>, fine-tuned on branded product datasets for marketing personalization.</w:t>
+        <w:t xml:space="preserve">Built a text-to-image synthesis system using Stable Diffusion and DreamBooth, fine-tuned on branded product datasets for marketing personalization.</w:t>
       </w:r>
     </w:p>
     <w:p>
@@ -4115,31 +2231,7 @@
           <w:lang w:eastAsia="en-GB"/>
           <w14:ligatures w14:val="none"/>
         </w:rPr>
-        <w:t xml:space="preserve">Orchestrated the training workflow on AWS EC2 with distributed training via </w:t>
-      </w:r>
-      <w:proofErr w:type="spellStart"/>
-      <w:r>
-        <w:rPr>
-          <w:rFonts w:ascii="Century Gothic" w:eastAsia="Times New Roman" w:hAnsi="Century Gothic" w:cs="Times New Roman"/>
-          <w:kern w:val="0"/>
-          <w:sz w:val="15"/>
-          <w:szCs w:val="15"/>
-          <w:lang w:eastAsia="en-GB"/>
-          <w14:ligatures w14:val="none"/>
-        </w:rPr>
-        <w:t>PyTorch</w:t>
-      </w:r>
-      <w:proofErr w:type="spellEnd"/>
-      <w:r>
-        <w:rPr>
-          <w:rFonts w:ascii="Century Gothic" w:eastAsia="Times New Roman" w:hAnsi="Century Gothic" w:cs="Times New Roman"/>
-          <w:kern w:val="0"/>
-          <w:sz w:val="15"/>
-          <w:szCs w:val="15"/>
-          <w:lang w:eastAsia="en-GB"/>
-          <w14:ligatures w14:val="none"/>
-        </w:rPr>
-        <w:t xml:space="preserve"> Lightning and DDP, reducing training time by 40%.</w:t>
+        <w:t xml:space="preserve">Orchestrated the training workflow on AWS EC2 with distributed training via PyTorch Lightning and DDP, reducing training time by 40%.</w:t>
       </w:r>
     </w:p>
     <w:p>
@@ -4170,55 +2262,7 @@
           <w:lang w:eastAsia="en-GB"/>
           <w14:ligatures w14:val="none"/>
         </w:rPr>
-        <w:t xml:space="preserve">Packaged outputs via </w:t>
-      </w:r>
-      <w:proofErr w:type="spellStart"/>
-      <w:r>
-        <w:rPr>
-          <w:rFonts w:ascii="Century Gothic" w:eastAsia="Times New Roman" w:hAnsi="Century Gothic" w:cs="Times New Roman"/>
-          <w:kern w:val="0"/>
-          <w:sz w:val="15"/>
-          <w:szCs w:val="15"/>
-          <w:lang w:eastAsia="en-GB"/>
-          <w14:ligatures w14:val="none"/>
-        </w:rPr>
-        <w:t>Streamlit</w:t>
-      </w:r>
-      <w:proofErr w:type="spellEnd"/>
-      <w:r>
-        <w:rPr>
-          <w:rFonts w:ascii="Century Gothic" w:eastAsia="Times New Roman" w:hAnsi="Century Gothic" w:cs="Times New Roman"/>
-          <w:kern w:val="0"/>
-          <w:sz w:val="15"/>
-          <w:szCs w:val="15"/>
-          <w:lang w:eastAsia="en-GB"/>
-          <w14:ligatures w14:val="none"/>
-        </w:rPr>
-        <w:t xml:space="preserve"> and </w:t>
-      </w:r>
-      <w:proofErr w:type="spellStart"/>
-      <w:r>
-        <w:rPr>
-          <w:rFonts w:ascii="Century Gothic" w:eastAsia="Times New Roman" w:hAnsi="Century Gothic" w:cs="Times New Roman"/>
-          <w:kern w:val="0"/>
-          <w:sz w:val="15"/>
-          <w:szCs w:val="15"/>
-          <w:lang w:eastAsia="en-GB"/>
-          <w14:ligatures w14:val="none"/>
-        </w:rPr>
-        <w:t>Gradio</w:t>
-      </w:r>
-      <w:proofErr w:type="spellEnd"/>
-      <w:r>
-        <w:rPr>
-          <w:rFonts w:ascii="Century Gothic" w:eastAsia="Times New Roman" w:hAnsi="Century Gothic" w:cs="Times New Roman"/>
-          <w:kern w:val="0"/>
-          <w:sz w:val="15"/>
-          <w:szCs w:val="15"/>
-          <w:lang w:eastAsia="en-GB"/>
-          <w14:ligatures w14:val="none"/>
-        </w:rPr>
-        <w:t xml:space="preserve"> to create an internal web tool used by design and branding teams.</w:t>
+        <w:t xml:space="preserve">Packaged outputs via Streamlit and Gradio to create an internal web tool used by design and branding teams.</w:t>
       </w:r>
     </w:p>
     <w:p>
@@ -4244,35 +2288,7 @@
           <w:lang w:eastAsia="en-GB"/>
           <w14:ligatures w14:val="none"/>
         </w:rPr>
-        <w:t xml:space="preserve">LLM-Powered Credit Risk </w:t>
-      </w:r>
-      <w:proofErr w:type="spellStart"/>
-      <w:r>
-        <w:rPr>
-          <w:rFonts w:ascii="Century Gothic" w:eastAsia="Times New Roman" w:hAnsi="Century Gothic" w:cs="Times New Roman"/>
-          <w:b/>
-          <w:bCs/>
-          <w:kern w:val="0"/>
-          <w:sz w:val="15"/>
-          <w:szCs w:val="15"/>
-          <w:lang w:eastAsia="en-GB"/>
-          <w14:ligatures w14:val="none"/>
-        </w:rPr>
-        <w:t>Modeling</w:t>
-      </w:r>
-      <w:proofErr w:type="spellEnd"/>
-      <w:r>
-        <w:rPr>
-          <w:rFonts w:ascii="Century Gothic" w:eastAsia="Times New Roman" w:hAnsi="Century Gothic" w:cs="Times New Roman"/>
-          <w:b/>
-          <w:bCs/>
-          <w:kern w:val="0"/>
-          <w:sz w:val="15"/>
-          <w:szCs w:val="15"/>
-          <w:lang w:eastAsia="en-GB"/>
-          <w14:ligatures w14:val="none"/>
-        </w:rPr>
-        <w:t xml:space="preserve"> Framework</w:t>
+        <w:t xml:space="preserve">LLM-Powered Credit Risk Modeling Framework</w:t>
       </w:r>
     </w:p>
     <w:p>
@@ -4334,31 +2350,7 @@
           <w:lang w:eastAsia="en-GB"/>
           <w14:ligatures w14:val="none"/>
         </w:rPr>
-        <w:t xml:space="preserve">Integrated LIME and </w:t>
-      </w:r>
-      <w:proofErr w:type="spellStart"/>
-      <w:r>
-        <w:rPr>
-          <w:rFonts w:ascii="Century Gothic" w:eastAsia="Times New Roman" w:hAnsi="Century Gothic" w:cs="Times New Roman"/>
-          <w:kern w:val="0"/>
-          <w:sz w:val="15"/>
-          <w:szCs w:val="15"/>
-          <w:lang w:eastAsia="en-GB"/>
-          <w14:ligatures w14:val="none"/>
-        </w:rPr>
-        <w:t>Fairlearn</w:t>
-      </w:r>
-      <w:proofErr w:type="spellEnd"/>
-      <w:r>
-        <w:rPr>
-          <w:rFonts w:ascii="Century Gothic" w:eastAsia="Times New Roman" w:hAnsi="Century Gothic" w:cs="Times New Roman"/>
-          <w:kern w:val="0"/>
-          <w:sz w:val="15"/>
-          <w:szCs w:val="15"/>
-          <w:lang w:eastAsia="en-GB"/>
-          <w14:ligatures w14:val="none"/>
-        </w:rPr>
-        <w:t xml:space="preserve"> to expose hidden biases, improving fairness metrics and meeting audit transparency standards.</w:t>
+        <w:t xml:space="preserve">Integrated LIME and Fairlearn to expose hidden biases, improving fairness metrics and meeting audit transparency standards.</w:t>
       </w:r>
     </w:p>
     <w:p>
@@ -4472,83 +2464,11 @@
           <w14:ligatures w14:val="none"/>
         </w:rPr>
         <w:t xml:space="preserve">Master of Science in Computer Science          </w:t>
-      </w:r>
-      <w:r>
-        <w:rPr>
-          <w:rFonts w:ascii="Century Gothic" w:eastAsia="Times New Roman" w:hAnsi="Century Gothic" w:cs="Times New Roman"/>
-          <w:b/>
-          <w:bCs/>
-          <w:kern w:val="0"/>
-          <w:sz w:val="15"/>
-          <w:szCs w:val="15"/>
-          <w:lang w:eastAsia="en-GB"/>
-          <w14:ligatures w14:val="none"/>
-        </w:rPr>
         <w:tab/>
-      </w:r>
-      <w:r>
-        <w:rPr>
-          <w:rFonts w:ascii="Century Gothic" w:eastAsia="Times New Roman" w:hAnsi="Century Gothic" w:cs="Times New Roman"/>
-          <w:b/>
-          <w:bCs/>
-          <w:kern w:val="0"/>
-          <w:sz w:val="15"/>
-          <w:szCs w:val="15"/>
-          <w:lang w:eastAsia="en-GB"/>
-          <w14:ligatures w14:val="none"/>
-        </w:rPr>
         <w:tab/>
-      </w:r>
-      <w:r>
-        <w:rPr>
-          <w:rFonts w:ascii="Century Gothic" w:eastAsia="Times New Roman" w:hAnsi="Century Gothic" w:cs="Times New Roman"/>
-          <w:b/>
-          <w:bCs/>
-          <w:kern w:val="0"/>
-          <w:sz w:val="15"/>
-          <w:szCs w:val="15"/>
-          <w:lang w:eastAsia="en-GB"/>
-          <w14:ligatures w14:val="none"/>
-        </w:rPr>
         <w:tab/>
-      </w:r>
-      <w:r>
-        <w:rPr>
-          <w:rFonts w:ascii="Century Gothic" w:eastAsia="Times New Roman" w:hAnsi="Century Gothic" w:cs="Times New Roman"/>
-          <w:b/>
-          <w:bCs/>
-          <w:kern w:val="0"/>
-          <w:sz w:val="15"/>
-          <w:szCs w:val="15"/>
-          <w:lang w:eastAsia="en-GB"/>
-          <w14:ligatures w14:val="none"/>
-        </w:rPr>
         <w:tab/>
-      </w:r>
-      <w:r>
-        <w:rPr>
-          <w:rFonts w:ascii="Century Gothic" w:eastAsia="Times New Roman" w:hAnsi="Century Gothic" w:cs="Times New Roman"/>
-          <w:b/>
-          <w:bCs/>
-          <w:kern w:val="0"/>
-          <w:sz w:val="15"/>
-          <w:szCs w:val="15"/>
-          <w:lang w:eastAsia="en-GB"/>
-          <w14:ligatures w14:val="none"/>
-        </w:rPr>
         <w:tab/>
-      </w:r>
-      <w:r>
-        <w:rPr>
-          <w:rFonts w:ascii="Century Gothic" w:eastAsia="Times New Roman" w:hAnsi="Century Gothic" w:cs="Times New Roman"/>
-          <w:b/>
-          <w:bCs/>
-          <w:kern w:val="0"/>
-          <w:sz w:val="15"/>
-          <w:szCs w:val="15"/>
-          <w:lang w:eastAsia="en-GB"/>
-          <w14:ligatures w14:val="none"/>
-        </w:rPr>
         <w:tab/>
         <w:t xml:space="preserve">      Aug 2023 – May 2025</w:t>
       </w:r>

</xml_diff>